<commit_message>
Actualizar el documento de historias de usuario con la V3
Ajustes a los criterios de las HU-02, 06, 18, 25, 27 a 31, 33 y 43 por las
decisiones de la V3, nuevo título de la HU-29, épica E12 con las HU-44 a
HU-50 y totales del resumen. Corrección de la HU-06 en la Entrega 3.

Co-Authored-By: Claude Opus 5.5 <noreply@anthropic.com>
</commit_message>
<xml_diff>
--- a/TP/GhostMan — Historias de usuario.docx
+++ b/TP/GhostMan — Historias de usuario.docx
@@ -34,7 +34,7 @@
         <w:rPr>
           <w:rtl w:val="0"/>
         </w:rPr>
-        <w:t>GhostMan tiene 43 historias de usuario repartidas en 3 versiones y 11 épicas.</w:t>
+        <w:t xml:space="preserve">GhostMan tiene 50 historias de usuario repartidas en 3 versiones y 12 épicas.</w:t>
       </w:r>
       <w:r>
         <w:rPr>
@@ -1479,6 +1479,68 @@
           </w:p>
         </w:tc>
       </w:tr>
+      <w:tr>
+        <w:trPr>
+          <w:cantSplit w:val="0"/>
+          <w:tblHeader w:val="0"/>
+        </w:trPr>
+        <w:tc>
+          <w:tcPr/>
+          <w:p>
+            <w:pPr>
+              <w:rPr/>
+            </w:pPr>
+            <w:r>
+              <w:rPr>
+                <w:rtl w:val="0"/>
+              </w:rPr>
+              <w:t xml:space="preserve">E12</w:t>
+            </w:r>
+          </w:p>
+        </w:tc>
+        <w:tc>
+          <w:tcPr/>
+          <w:p>
+            <w:pPr>
+              <w:rPr/>
+            </w:pPr>
+            <w:r>
+              <w:rPr>
+                <w:rtl w:val="0"/>
+              </w:rPr>
+              <w:t xml:space="preserve">Look &amp; feel</w:t>
+            </w:r>
+          </w:p>
+        </w:tc>
+        <w:tc>
+          <w:tcPr/>
+          <w:p>
+            <w:pPr>
+              <w:rPr/>
+            </w:pPr>
+            <w:r>
+              <w:rPr>
+                <w:rtl w:val="0"/>
+              </w:rPr>
+              <w:t xml:space="preserve">V3</w:t>
+            </w:r>
+          </w:p>
+        </w:tc>
+        <w:tc>
+          <w:tcPr/>
+          <w:p>
+            <w:pPr>
+              <w:rPr/>
+            </w:pPr>
+            <w:r>
+              <w:rPr>
+                <w:rtl w:val="0"/>
+              </w:rPr>
+              <w:t xml:space="preserve">HU-44 a HU-50</w:t>
+            </w:r>
+          </w:p>
+        </w:tc>
+      </w:tr>
     </w:tbl>
     <w:p>
       <w:pPr>
@@ -2132,7 +2194,7 @@
           <w:vertAlign w:val="baseline"/>
           <w:rtl w:val="0"/>
         </w:rPr>
-        <w:t xml:space="preserve">Pacman no puede salir de los límites del mapa.</w:t>
+        <w:t xml:space="preserve">Pacman no puede salir de los límites del mapa, salvo por el túnel, que lo lleva al borde opuesto (decisión 48).</w:t>
       </w:r>
     </w:p>
     <w:p>
@@ -3556,7 +3618,7 @@
           <w:vertAlign w:val="baseline"/>
           <w:rtl w:val="0"/>
         </w:rPr>
-        <w:t xml:space="preserve">El fantasma comido vuelve a su punto de reaparición y reaparece a los 5 segundos con su comportamiento normal.</w:t>
+        <w:t xml:space="preserve">El fantasma comido queda reducido a sus ojos, que vuelven a la base; al entrar, el fantasma revive y vuelve a salir con su comportamiento normal (decisión 46).</w:t>
       </w:r>
     </w:p>
     <w:p>
@@ -7680,7 +7742,7 @@
           <w:vertAlign w:val="baseline"/>
           <w:rtl w:val="0"/>
         </w:rPr>
-        <w:t xml:space="preserve">El espectro no puede usar su habilidad para salir de los límites del mapa.</w:t>
+        <w:t xml:space="preserve">El espectro no puede usar su habilidad para salir de los límites del mapa ni para atravesar los muros de la base de los fantasmas (decisiones 26 y 49).</w:t>
       </w:r>
     </w:p>
     <w:p>
@@ -10246,6 +10308,49 @@
     </w:p>
     <w:p>
       <w:pPr>
+        <w:keepNext w:val="0"/>
+        <w:keepLines w:val="0"/>
+        <w:pageBreakBefore w:val="0"/>
+        <w:widowControl w:val="1"/>
+        <w:numPr>
+          <w:ilvl w:val="0"/>
+          <w:numId w:val="19"/>
+        </w:numPr>
+        <w:pBdr>
+          <w:top w:space="0" w:sz="0" w:val="nil"/>
+          <w:left w:space="0" w:sz="0" w:val="nil"/>
+          <w:bottom w:space="0" w:sz="0" w:val="nil"/>
+          <w:right w:space="0" w:sz="0" w:val="nil"/>
+          <w:between w:space="0" w:sz="0" w:val="nil"/>
+        </w:pBdr>
+        <w:shd w:fill="auto" w:val="clear"/>
+        <w:spacing w:after="160" w:before="0" w:line="259" w:lineRule="auto"/>
+        <w:ind w:left="720" w:right="0" w:hanging="360"/>
+        <w:jc w:val="left"/>
+        <w:rPr/>
+      </w:pPr>
+      <w:r>
+        <w:rPr>
+          <w:rFonts w:ascii="Calibri" w:cs="Calibri" w:eastAsia="Calibri" w:hAnsi="Calibri"/>
+          <w:b w:val="0"/>
+          <w:bCs w:val="0"/>
+          <w:i w:val="0"/>
+          <w:iCs w:val="0"/>
+          <w:smallCaps w:val="0"/>
+          <w:strike w:val="0"/>
+          <w:color w:val="000000"/>
+          <w:sz w:val="22"/>
+          <w:szCs w:val="22"/>
+          <w:u w:val="none"/>
+          <w:shd w:fill="auto" w:val="clear"/>
+          <w:vertAlign w:val="baseline"/>
+          <w:rtl w:val="0"/>
+        </w:rPr>
+        <w:t xml:space="preserve">El fantasma del jugador arranca dentro de la base y sale cuando el jugador lo mueve hacia la puerta (decisiones 34 y 45).</w:t>
+      </w:r>
+    </w:p>
+    <w:p>
+      <w:pPr>
         <w:pStyle w:val="Heading4"/>
         <w:rPr/>
       </w:pPr>
@@ -10689,7 +10794,7 @@
           <w:vertAlign w:val="baseline"/>
           <w:rtl w:val="0"/>
         </w:rPr>
-        <w:t xml:space="preserve">Con el PowerUp activo, el contacto con Pacman envía al fantasma del jugador a su punto de reaparición.</w:t>
+        <w:t xml:space="preserve">Con el PowerUp activo, el contacto con Pacman reduce al fantasma del jugador a sus ojos, que vuelven solos a la base (decisión 46).</w:t>
       </w:r>
     </w:p>
     <w:p>
@@ -10732,7 +10837,7 @@
           <w:vertAlign w:val="baseline"/>
           <w:rtl w:val="0"/>
         </w:rPr>
-        <w:t xml:space="preserve">El jugador no controla al fantasma durante el tiempo de reaparición, y el tiempo restante se indica en pantalla.</w:t>
+        <w:t xml:space="preserve">El jugador no controla al fantasma mientras sus ojos vuelven a la base, y recupera el control al revivir (decisión 46).</w:t>
       </w:r>
     </w:p>
     <w:p>
@@ -10775,7 +10880,7 @@
           <w:vertAlign w:val="baseline"/>
           <w:rtl w:val="0"/>
         </w:rPr>
-        <w:t xml:space="preserve">El tiempo de reaparición es de 5 segundos, u 8 segundos si el fantasma del jugador es de tipo naval.</w:t>
+        <w:t xml:space="preserve">Si el fantasma del jugador es de tipo naval, espera 3 segundos dentro de la base antes de poder salir (decisión 46).</w:t>
       </w:r>
     </w:p>
     <w:p>
@@ -10861,7 +10966,7 @@
           <w:vertAlign w:val="baseline"/>
           <w:rtl w:val="0"/>
         </w:rPr>
-        <w:t xml:space="preserve">El poder del fantasma no puede activarse mientras está esperando reaparecer.</w:t>
+        <w:t xml:space="preserve">El poder del fantasma no puede activarse mientras está comido, pero su cooldown sigue corriendo (decisión 47).</w:t>
       </w:r>
     </w:p>
     <w:p>
@@ -11269,7 +11374,7 @@
           <w:vertAlign w:val="baseline"/>
           <w:rtl w:val="0"/>
         </w:rPr>
-        <w:t xml:space="preserve">La habilidad no puede usarse para salir de los límites del mapa.</w:t>
+        <w:t xml:space="preserve">La habilidad no puede usarse para salir de los límites del mapa ni para atravesar los muros de la base de los fantasmas (decisión 49).</w:t>
       </w:r>
     </w:p>
     <w:p>
@@ -11324,7 +11429,7 @@
         <w:rPr>
           <w:rtl w:val="0"/>
         </w:rPr>
-        <w:t xml:space="preserve">HU-29 · Teletransportarse con el Saltarín</w:t>
+        <w:t xml:space="preserve">HU-29 · Saltar hacia adelante con el Saltarín</w:t>
       </w:r>
     </w:p>
     <w:p>
@@ -11375,7 +11480,7 @@
         <w:rPr>
           <w:rtl w:val="0"/>
         </w:rPr>
-        <w:t xml:space="preserve"> teletransportarme a un punto cercano con el Saltarín </w:t>
+        <w:t xml:space="preserve"> saltar hacia adelante con el Saltarín </w:t>
       </w:r>
       <w:r>
         <w:rPr>
@@ -11389,7 +11494,7 @@
         <w:rPr>
           <w:rtl w:val="0"/>
         </w:rPr>
-        <w:t xml:space="preserve"> acortar distancias con Pacman, aceptando el riesgo de no elegir el destino.</w:t>
+        <w:t xml:space="preserve"> acortar distancias con Pacman, aceptando el riesgo de no elegir la celda exacta de destino.</w:t>
       </w:r>
     </w:p>
     <w:p>
@@ -11450,7 +11555,7 @@
           <w:vertAlign w:val="baseline"/>
           <w:rtl w:val="0"/>
         </w:rPr>
-        <w:t xml:space="preserve">La barra espaciadora teletransporta al fantasma a una celda aleatoria dentro de un radio de 10 celdas.</w:t>
+        <w:t xml:space="preserve">La barra espaciadora hace saltar al fantasma a una celda aleatoria dentro de un radio de 10 celdas, estrictamente adelante en su dirección de avance (decisiones 38 y 41).</w:t>
       </w:r>
     </w:p>
     <w:p>
@@ -11536,7 +11641,7 @@
           <w:vertAlign w:val="baseline"/>
           <w:rtl w:val="0"/>
         </w:rPr>
-        <w:t xml:space="preserve">El destino no es elegible ni predecible por el jugador.</w:t>
+        <w:t xml:space="preserve">La celda de destino no es elegible por el jugador: elige hacia dónde salta, no a qué celda (decisión 38).</w:t>
       </w:r>
     </w:p>
     <w:p>
@@ -11665,7 +11770,136 @@
           <w:vertAlign w:val="baseline"/>
           <w:rtl w:val="0"/>
         </w:rPr>
-        <w:t xml:space="preserve">Si el salto ubica al fantasma sobre Pacman y Pacman no tiene el PowerUp activo, Pacman pierde una vida.</w:t>
+        <w:t xml:space="preserve">Si el fantasma aterriza sobre Pacman y Pacman no tiene el PowerUp activo, Pacman pierde una vida (decisión 55).</w:t>
+      </w:r>
+    </w:p>
+    <w:p>
+      <w:pPr>
+        <w:keepNext w:val="0"/>
+        <w:keepLines w:val="0"/>
+        <w:pageBreakBefore w:val="0"/>
+        <w:widowControl w:val="1"/>
+        <w:numPr>
+          <w:ilvl w:val="0"/>
+          <w:numId w:val="24"/>
+        </w:numPr>
+        <w:pBdr>
+          <w:top w:space="0" w:sz="0" w:val="nil"/>
+          <w:left w:space="0" w:sz="0" w:val="nil"/>
+          <w:bottom w:space="0" w:sz="0" w:val="nil"/>
+          <w:right w:space="0" w:sz="0" w:val="nil"/>
+          <w:between w:space="0" w:sz="0" w:val="nil"/>
+        </w:pBdr>
+        <w:shd w:fill="auto" w:val="clear"/>
+        <w:spacing w:after="0" w:before="0" w:line="259" w:lineRule="auto"/>
+        <w:ind w:left="720" w:right="0" w:hanging="360"/>
+        <w:jc w:val="left"/>
+        <w:rPr/>
+      </w:pPr>
+      <w:r>
+        <w:rPr>
+          <w:rFonts w:ascii="Calibri" w:cs="Calibri" w:eastAsia="Calibri" w:hAnsi="Calibri"/>
+          <w:b w:val="0"/>
+          <w:bCs w:val="0"/>
+          <w:i w:val="0"/>
+          <w:iCs w:val="0"/>
+          <w:smallCaps w:val="0"/>
+          <w:strike w:val="0"/>
+          <w:color w:val="000000"/>
+          <w:sz w:val="22"/>
+          <w:szCs w:val="22"/>
+          <w:u w:val="none"/>
+          <w:shd w:fill="auto" w:val="clear"/>
+          <w:vertAlign w:val="baseline"/>
+          <w:rtl w:val="0"/>
+        </w:rPr>
+        <w:t xml:space="preserve">El salto dura 0,6 segundos y la celda de destino se marca antes del aterrizaje (decisión 55).</w:t>
+      </w:r>
+    </w:p>
+    <w:p>
+      <w:pPr>
+        <w:keepNext w:val="0"/>
+        <w:keepLines w:val="0"/>
+        <w:pageBreakBefore w:val="0"/>
+        <w:widowControl w:val="1"/>
+        <w:numPr>
+          <w:ilvl w:val="0"/>
+          <w:numId w:val="24"/>
+        </w:numPr>
+        <w:pBdr>
+          <w:top w:space="0" w:sz="0" w:val="nil"/>
+          <w:left w:space="0" w:sz="0" w:val="nil"/>
+          <w:bottom w:space="0" w:sz="0" w:val="nil"/>
+          <w:right w:space="0" w:sz="0" w:val="nil"/>
+          <w:between w:space="0" w:sz="0" w:val="nil"/>
+        </w:pBdr>
+        <w:shd w:fill="auto" w:val="clear"/>
+        <w:spacing w:after="0" w:before="0" w:line="259" w:lineRule="auto"/>
+        <w:ind w:left="720" w:right="0" w:hanging="360"/>
+        <w:jc w:val="left"/>
+        <w:rPr/>
+      </w:pPr>
+      <w:r>
+        <w:rPr>
+          <w:rFonts w:ascii="Calibri" w:cs="Calibri" w:eastAsia="Calibri" w:hAnsi="Calibri"/>
+          <w:b w:val="0"/>
+          <w:bCs w:val="0"/>
+          <w:i w:val="0"/>
+          <w:iCs w:val="0"/>
+          <w:smallCaps w:val="0"/>
+          <w:strike w:val="0"/>
+          <w:color w:val="000000"/>
+          <w:sz w:val="22"/>
+          <w:szCs w:val="22"/>
+          <w:u w:val="none"/>
+          <w:shd w:fill="auto" w:val="clear"/>
+          <w:vertAlign w:val="baseline"/>
+          <w:rtl w:val="0"/>
+        </w:rPr>
+        <w:t xml:space="preserve">Durante el salto el fantasma no colisiona con nada (decisión 55).</w:t>
+      </w:r>
+    </w:p>
+    <w:p>
+      <w:pPr>
+        <w:keepNext w:val="0"/>
+        <w:keepLines w:val="0"/>
+        <w:pageBreakBefore w:val="0"/>
+        <w:widowControl w:val="1"/>
+        <w:numPr>
+          <w:ilvl w:val="0"/>
+          <w:numId w:val="24"/>
+        </w:numPr>
+        <w:pBdr>
+          <w:top w:space="0" w:sz="0" w:val="nil"/>
+          <w:left w:space="0" w:sz="0" w:val="nil"/>
+          <w:bottom w:space="0" w:sz="0" w:val="nil"/>
+          <w:right w:space="0" w:sz="0" w:val="nil"/>
+          <w:between w:space="0" w:sz="0" w:val="nil"/>
+        </w:pBdr>
+        <w:shd w:fill="auto" w:val="clear"/>
+        <w:spacing w:after="0" w:before="0" w:line="259" w:lineRule="auto"/>
+        <w:ind w:left="720" w:right="0" w:hanging="360"/>
+        <w:jc w:val="left"/>
+        <w:rPr/>
+      </w:pPr>
+      <w:r>
+        <w:rPr>
+          <w:rFonts w:ascii="Calibri" w:cs="Calibri" w:eastAsia="Calibri" w:hAnsi="Calibri"/>
+          <w:b w:val="0"/>
+          <w:bCs w:val="0"/>
+          <w:i w:val="0"/>
+          <w:iCs w:val="0"/>
+          <w:smallCaps w:val="0"/>
+          <w:strike w:val="0"/>
+          <w:color w:val="000000"/>
+          <w:sz w:val="22"/>
+          <w:szCs w:val="22"/>
+          <w:u w:val="none"/>
+          <w:shd w:fill="auto" w:val="clear"/>
+          <w:vertAlign w:val="baseline"/>
+          <w:rtl w:val="0"/>
+        </w:rPr>
+        <w:t xml:space="preserve">Si no hay ninguna celda válida adelante, el salto no se ejecuta y el poder no entra en cooldown (decisión 41).</w:t>
       </w:r>
     </w:p>
     <w:p>
@@ -12233,7 +12467,7 @@
           <w:vertAlign w:val="baseline"/>
           <w:rtl w:val="0"/>
         </w:rPr>
-        <w:t xml:space="preserve">El Naval se desplaza un 20 % más lento que el fantasma clásico y tarda 8 segundos en reaparecer.</w:t>
+        <w:t xml:space="preserve">El Naval se desplaza un 20 % más lento que el fantasma clásico y, al ser comido, espera 3 segundos dentro de la base antes de salir (decisión 46).</w:t>
       </w:r>
     </w:p>
     <w:p>
@@ -12320,6 +12554,49 @@
           <w:rtl w:val="0"/>
         </w:rPr>
         <w:t>Si Pacman pierde una vida por una fruta falsa en modo GhostMan, cuenta como derrota producida por el jugador (decisión 27).</w:t>
+      </w:r>
+    </w:p>
+    <w:p>
+      <w:pPr>
+        <w:keepNext w:val="0"/>
+        <w:keepLines w:val="0"/>
+        <w:pageBreakBefore w:val="0"/>
+        <w:widowControl w:val="1"/>
+        <w:numPr>
+          <w:ilvl w:val="0"/>
+          <w:numId w:val="25"/>
+        </w:numPr>
+        <w:pBdr>
+          <w:top w:space="0" w:sz="0" w:val="nil"/>
+          <w:left w:space="0" w:sz="0" w:val="nil"/>
+          <w:bottom w:space="0" w:sz="0" w:val="nil"/>
+          <w:right w:space="0" w:sz="0" w:val="nil"/>
+          <w:between w:space="0" w:sz="0" w:val="nil"/>
+        </w:pBdr>
+        <w:shd w:fill="auto" w:val="clear"/>
+        <w:spacing w:after="160" w:before="0" w:line="259" w:lineRule="auto"/>
+        <w:ind w:left="720" w:right="0" w:hanging="360"/>
+        <w:jc w:val="left"/>
+        <w:rPr/>
+      </w:pPr>
+      <w:r>
+        <w:rPr>
+          <w:rFonts w:ascii="Calibri" w:cs="Calibri" w:eastAsia="Calibri" w:hAnsi="Calibri"/>
+          <w:b w:val="0"/>
+          <w:bCs w:val="0"/>
+          <w:i w:val="0"/>
+          <w:iCs w:val="0"/>
+          <w:smallCaps w:val="0"/>
+          <w:strike w:val="0"/>
+          <w:color w:val="000000"/>
+          <w:sz w:val="22"/>
+          <w:szCs w:val="22"/>
+          <w:u w:val="none"/>
+          <w:shd w:fill="auto" w:val="clear"/>
+          <w:vertAlign w:val="baseline"/>
+          <w:rtl w:val="0"/>
+        </w:rPr>
+        <w:t xml:space="preserve">La IA de Pacman no consume una fruta falsa que vio colocar a 8 celdas de recorrido o menos, mientras la recuerde (decisiones 37 y 42).</w:t>
       </w:r>
     </w:p>
     <w:p>
@@ -12457,7 +12734,7 @@
           <w:vertAlign w:val="baseline"/>
           <w:rtl w:val="0"/>
         </w:rPr>
-        <w:t xml:space="preserve">La barra espaciadora desplaza al fantasma hasta 3 celdas en su dirección de avance.</w:t>
+        <w:t xml:space="preserve">La barra espaciadora impulsa al fantasma hasta 3 celdas en su dirección de avance, recorriéndolas en 0,25 segundos (decisión 54).</w:t>
       </w:r>
     </w:p>
     <w:p>
@@ -12629,7 +12906,7 @@
           <w:vertAlign w:val="baseline"/>
           <w:rtl w:val="0"/>
         </w:rPr>
-        <w:t xml:space="preserve">El dash no atraviesa paredes ni los límites del mapa.</w:t>
+        <w:t xml:space="preserve">El dash no atraviesa paredes ni los límites del mapa, salvo por el túnel, que lo lleva al borde opuesto (decisión 48).</w:t>
       </w:r>
     </w:p>
     <w:p>
@@ -12672,7 +12949,7 @@
           <w:vertAlign w:val="baseline"/>
           <w:rtl w:val="0"/>
         </w:rPr>
-        <w:t xml:space="preserve">Si el dash termina sobre Pacman y Pacman no tiene el PowerUp activo, Pacman pierde una vida.</w:t>
+        <w:t xml:space="preserve">Si el dash pasa por Pacman o termina sobre él y Pacman no tiene el PowerUp activo, Pacman pierde una vida (decisiones 32 y 54).</w:t>
       </w:r>
     </w:p>
     <w:p>
@@ -13438,6 +13715,49 @@
     </w:p>
     <w:p>
       <w:pPr>
+        <w:keepNext w:val="0"/>
+        <w:keepLines w:val="0"/>
+        <w:pageBreakBefore w:val="0"/>
+        <w:widowControl w:val="1"/>
+        <w:numPr>
+          <w:ilvl w:val="0"/>
+          <w:numId w:val="28"/>
+        </w:numPr>
+        <w:pBdr>
+          <w:top w:space="0" w:sz="0" w:val="nil"/>
+          <w:left w:space="0" w:sz="0" w:val="nil"/>
+          <w:bottom w:space="0" w:sz="0" w:val="nil"/>
+          <w:right w:space="0" w:sz="0" w:val="nil"/>
+          <w:between w:space="0" w:sz="0" w:val="nil"/>
+        </w:pBdr>
+        <w:shd w:fill="auto" w:val="clear"/>
+        <w:spacing w:after="160" w:before="0" w:line="259" w:lineRule="auto"/>
+        <w:ind w:left="720" w:right="0" w:hanging="360"/>
+        <w:jc w:val="left"/>
+        <w:rPr/>
+      </w:pPr>
+      <w:r>
+        <w:rPr>
+          <w:rFonts w:ascii="Calibri" w:cs="Calibri" w:eastAsia="Calibri" w:hAnsi="Calibri"/>
+          <w:b w:val="0"/>
+          <w:bCs w:val="0"/>
+          <w:i w:val="0"/>
+          <w:iCs w:val="0"/>
+          <w:smallCaps w:val="0"/>
+          <w:strike w:val="0"/>
+          <w:color w:val="000000"/>
+          <w:sz w:val="22"/>
+          <w:szCs w:val="22"/>
+          <w:u w:val="none"/>
+          <w:shd w:fill="auto" w:val="clear"/>
+          <w:vertAlign w:val="baseline"/>
+          <w:rtl w:val="0"/>
+        </w:rPr>
+        <w:t xml:space="preserve">Los muros de la base de los fantasmas y los del borde del mapa son indestructibles (decisión 49).</w:t>
+      </w:r>
+    </w:p>
+    <w:p>
+      <w:pPr>
         <w:pStyle w:val="Heading4"/>
         <w:rPr/>
       </w:pPr>
@@ -13979,7 +14299,7 @@
           <w:vertAlign w:val="baseline"/>
           <w:rtl w:val="0"/>
         </w:rPr>
-        <w:t>El saltarín de la IA se teletransporta según las reglas de la sección 4.6 de la Entrega 02 cuando Pacman está a distancia Manhattan ≤ 10.</w:t>
+        <w:t xml:space="preserve">El saltarín de la IA salta según las reglas de la sección 4.4 de la Entrega 03 cuando Pacman está a distancia Manhattan ≤ 10 (decisión 38).</w:t>
       </w:r>
     </w:p>
     <w:p>
@@ -14174,7 +14494,7 @@
         <w:rPr>
           <w:rtl w:val="0"/>
         </w:rPr>
-        <w:t xml:space="preserve">La V3 tiene 8 historias (HU-35 a HU-42) en las épicas E9 a E11: cuentas de usuario, tableros de puntaje y opciones.</w:t>
+        <w:t xml:space="preserve">La V3 tiene 15 historias (HU-35 a HU-42 y HU-44 a HU-50) en las épicas E9 a E12: cuentas de usuario, tableros de puntaje, opciones y look &amp; feel. Las HU-44 a HU-50 se agregaron al iniciar la V3 (sección 6.2 de la Entrega 03).</w:t>
       </w:r>
     </w:p>
     <w:p>
@@ -17168,6 +17488,2747 @@
     </w:p>
     <w:p>
       <w:pPr>
+        <w:pStyle w:val="Heading3"/>
+        <w:rPr/>
+      </w:pPr>
+      <w:r>
+        <w:rPr>
+          <w:rtl w:val="0"/>
+        </w:rPr>
+        <w:t xml:space="preserve">Épica E12 — Look &amp; feel</w:t>
+      </w:r>
+    </w:p>
+    <w:p>
+      <w:pPr>
+        <w:pStyle w:val="Heading4"/>
+        <w:rPr/>
+      </w:pPr>
+      <w:r>
+        <w:rPr>
+          <w:rtl w:val="0"/>
+        </w:rPr>
+        <w:t xml:space="preserve">HU-44 · Base de los fantasmas</w:t>
+      </w:r>
+    </w:p>
+    <w:p>
+      <w:pPr>
+        <w:rPr/>
+      </w:pPr>
+      <w:r>
+        <w:rPr>
+          <w:i w:val="1"/>
+          <w:iCs w:val="1"/>
+          <w:rtl w:val="0"/>
+        </w:rPr>
+        <w:t xml:space="preserve">Épica: E12 · Versión: V3 · Prioridad: Alta</w:t>
+      </w:r>
+      <w:r>
+        <w:rPr>
+          <w:rtl w:val="0"/>
+        </w:rPr>
+      </w:r>
+    </w:p>
+    <w:p>
+      <w:pPr>
+        <w:rPr/>
+      </w:pPr>
+      <w:r>
+        <w:rPr>
+          <w:b w:val="1"/>
+          <w:bCs w:val="1"/>
+          <w:rtl w:val="0"/>
+        </w:rPr>
+        <w:t xml:space="preserve">Como</w:t>
+      </w:r>
+      <w:r>
+        <w:rPr>
+          <w:rtl w:val="0"/>
+        </w:rPr>
+        <w:t xml:space="preserve"> jugador </w:t>
+      </w:r>
+      <w:r>
+        <w:rPr>
+          <w:b w:val="1"/>
+          <w:bCs w:val="1"/>
+          <w:rtl w:val="0"/>
+        </w:rPr>
+        <w:t xml:space="preserve">quiero</w:t>
+      </w:r>
+      <w:r>
+        <w:rPr>
+          <w:rtl w:val="0"/>
+        </w:rPr>
+        <w:t xml:space="preserve"> que los fantasmas aparezcan y vuelvan a una base en el centro del mapa </w:t>
+      </w:r>
+      <w:r>
+        <w:rPr>
+          <w:b w:val="1"/>
+          <w:bCs w:val="1"/>
+          <w:rtl w:val="0"/>
+        </w:rPr>
+        <w:t xml:space="preserve">para</w:t>
+      </w:r>
+      <w:r>
+        <w:rPr>
+          <w:rtl w:val="0"/>
+        </w:rPr>
+        <w:t xml:space="preserve"> reconocer la estructura del Pac-Man clásico y anticipar desde dónde salen los fantasmas.</w:t>
+      </w:r>
+    </w:p>
+    <w:p>
+      <w:pPr>
+        <w:rPr/>
+      </w:pPr>
+      <w:r>
+        <w:rPr>
+          <w:b w:val="1"/>
+          <w:bCs w:val="1"/>
+          <w:rtl w:val="0"/>
+        </w:rPr>
+        <w:t xml:space="preserve">Criterios de aceptación:</w:t>
+      </w:r>
+      <w:r>
+        <w:rPr>
+          <w:rtl w:val="0"/>
+        </w:rPr>
+      </w:r>
+    </w:p>
+    <w:p>
+      <w:pPr>
+        <w:keepNext w:val="0"/>
+        <w:keepLines w:val="0"/>
+        <w:pageBreakBefore w:val="0"/>
+        <w:widowControl w:val="1"/>
+        <w:numPr>
+          <w:ilvl w:val="0"/>
+          <w:numId w:val="38"/>
+        </w:numPr>
+        <w:pBdr>
+          <w:top w:space="0" w:sz="0" w:val="nil"/>
+          <w:left w:space="0" w:sz="0" w:val="nil"/>
+          <w:bottom w:space="0" w:sz="0" w:val="nil"/>
+          <w:right w:space="0" w:sz="0" w:val="nil"/>
+          <w:between w:space="0" w:sz="0" w:val="nil"/>
+        </w:pBdr>
+        <w:shd w:fill="auto" w:val="clear"/>
+        <w:spacing w:after="0" w:before="0" w:line="259" w:lineRule="auto"/>
+        <w:ind w:left="720" w:right="0" w:hanging="360"/>
+        <w:jc w:val="left"/>
+        <w:rPr/>
+      </w:pPr>
+      <w:r>
+        <w:rPr>
+          <w:rFonts w:ascii="Calibri" w:cs="Calibri" w:eastAsia="Calibri" w:hAnsi="Calibri"/>
+          <w:b w:val="0"/>
+          <w:bCs w:val="0"/>
+          <w:i w:val="0"/>
+          <w:iCs w:val="0"/>
+          <w:smallCaps w:val="0"/>
+          <w:strike w:val="0"/>
+          <w:color w:val="000000"/>
+          <w:sz w:val="22"/>
+          <w:szCs w:val="22"/>
+          <w:u w:val="none"/>
+          <w:shd w:fill="auto" w:val="clear"/>
+          <w:vertAlign w:val="baseline"/>
+          <w:rtl w:val="0"/>
+        </w:rPr>
+        <w:t xml:space="preserve">Los tres niveles tienen una base de los fantasmas en el centro del mapa, en la misma posición.</w:t>
+      </w:r>
+    </w:p>
+    <w:p>
+      <w:pPr>
+        <w:keepNext w:val="0"/>
+        <w:keepLines w:val="0"/>
+        <w:pageBreakBefore w:val="0"/>
+        <w:widowControl w:val="1"/>
+        <w:numPr>
+          <w:ilvl w:val="0"/>
+          <w:numId w:val="38"/>
+        </w:numPr>
+        <w:pBdr>
+          <w:top w:space="0" w:sz="0" w:val="nil"/>
+          <w:left w:space="0" w:sz="0" w:val="nil"/>
+          <w:bottom w:space="0" w:sz="0" w:val="nil"/>
+          <w:right w:space="0" w:sz="0" w:val="nil"/>
+          <w:between w:space="0" w:sz="0" w:val="nil"/>
+        </w:pBdr>
+        <w:shd w:fill="auto" w:val="clear"/>
+        <w:spacing w:after="0" w:before="0" w:line="259" w:lineRule="auto"/>
+        <w:ind w:left="720" w:right="0" w:hanging="360"/>
+        <w:jc w:val="left"/>
+        <w:rPr/>
+      </w:pPr>
+      <w:r>
+        <w:rPr>
+          <w:rFonts w:ascii="Calibri" w:cs="Calibri" w:eastAsia="Calibri" w:hAnsi="Calibri"/>
+          <w:b w:val="0"/>
+          <w:bCs w:val="0"/>
+          <w:i w:val="0"/>
+          <w:iCs w:val="0"/>
+          <w:smallCaps w:val="0"/>
+          <w:strike w:val="0"/>
+          <w:color w:val="000000"/>
+          <w:sz w:val="22"/>
+          <w:szCs w:val="22"/>
+          <w:u w:val="none"/>
+          <w:shd w:fill="auto" w:val="clear"/>
+          <w:vertAlign w:val="baseline"/>
+          <w:rtl w:val="0"/>
+        </w:rPr>
+        <w:t xml:space="preserve">Pacman no puede entrar a la base en ningún modo, ni siquiera con cargas de destrucción de paredes.</w:t>
+      </w:r>
+    </w:p>
+    <w:p>
+      <w:pPr>
+        <w:keepNext w:val="0"/>
+        <w:keepLines w:val="0"/>
+        <w:pageBreakBefore w:val="0"/>
+        <w:widowControl w:val="1"/>
+        <w:numPr>
+          <w:ilvl w:val="0"/>
+          <w:numId w:val="38"/>
+        </w:numPr>
+        <w:pBdr>
+          <w:top w:space="0" w:sz="0" w:val="nil"/>
+          <w:left w:space="0" w:sz="0" w:val="nil"/>
+          <w:bottom w:space="0" w:sz="0" w:val="nil"/>
+          <w:right w:space="0" w:sz="0" w:val="nil"/>
+          <w:between w:space="0" w:sz="0" w:val="nil"/>
+        </w:pBdr>
+        <w:shd w:fill="auto" w:val="clear"/>
+        <w:spacing w:after="0" w:before="0" w:line="259" w:lineRule="auto"/>
+        <w:ind w:left="720" w:right="0" w:hanging="360"/>
+        <w:jc w:val="left"/>
+        <w:rPr/>
+      </w:pPr>
+      <w:r>
+        <w:rPr>
+          <w:rFonts w:ascii="Calibri" w:cs="Calibri" w:eastAsia="Calibri" w:hAnsi="Calibri"/>
+          <w:b w:val="0"/>
+          <w:bCs w:val="0"/>
+          <w:i w:val="0"/>
+          <w:iCs w:val="0"/>
+          <w:smallCaps w:val="0"/>
+          <w:strike w:val="0"/>
+          <w:color w:val="000000"/>
+          <w:sz w:val="22"/>
+          <w:szCs w:val="22"/>
+          <w:u w:val="none"/>
+          <w:shd w:fill="auto" w:val="clear"/>
+          <w:vertAlign w:val="baseline"/>
+          <w:rtl w:val="0"/>
+        </w:rPr>
+        <w:t xml:space="preserve">Los muros de la base no se pueden atravesar con ningún poder.</w:t>
+      </w:r>
+    </w:p>
+    <w:p>
+      <w:pPr>
+        <w:keepNext w:val="0"/>
+        <w:keepLines w:val="0"/>
+        <w:pageBreakBefore w:val="0"/>
+        <w:widowControl w:val="1"/>
+        <w:numPr>
+          <w:ilvl w:val="0"/>
+          <w:numId w:val="38"/>
+        </w:numPr>
+        <w:pBdr>
+          <w:top w:space="0" w:sz="0" w:val="nil"/>
+          <w:left w:space="0" w:sz="0" w:val="nil"/>
+          <w:bottom w:space="0" w:sz="0" w:val="nil"/>
+          <w:right w:space="0" w:sz="0" w:val="nil"/>
+          <w:between w:space="0" w:sz="0" w:val="nil"/>
+        </w:pBdr>
+        <w:shd w:fill="auto" w:val="clear"/>
+        <w:spacing w:after="0" w:before="0" w:line="259" w:lineRule="auto"/>
+        <w:ind w:left="720" w:right="0" w:hanging="360"/>
+        <w:jc w:val="left"/>
+        <w:rPr/>
+      </w:pPr>
+      <w:r>
+        <w:rPr>
+          <w:rFonts w:ascii="Calibri" w:cs="Calibri" w:eastAsia="Calibri" w:hAnsi="Calibri"/>
+          <w:b w:val="0"/>
+          <w:bCs w:val="0"/>
+          <w:i w:val="0"/>
+          <w:iCs w:val="0"/>
+          <w:smallCaps w:val="0"/>
+          <w:strike w:val="0"/>
+          <w:color w:val="000000"/>
+          <w:sz w:val="22"/>
+          <w:szCs w:val="22"/>
+          <w:u w:val="none"/>
+          <w:shd w:fill="auto" w:val="clear"/>
+          <w:vertAlign w:val="baseline"/>
+          <w:rtl w:val="0"/>
+        </w:rPr>
+        <w:t xml:space="preserve">En modo Pacman, al inicio del nivel un fantasma está afuera, sobre la puerta, y los otros tres salen de a uno, cada 3 segundos desde el "¡ya!".</w:t>
+      </w:r>
+    </w:p>
+    <w:p>
+      <w:pPr>
+        <w:keepNext w:val="0"/>
+        <w:keepLines w:val="0"/>
+        <w:pageBreakBefore w:val="0"/>
+        <w:widowControl w:val="1"/>
+        <w:numPr>
+          <w:ilvl w:val="0"/>
+          <w:numId w:val="38"/>
+        </w:numPr>
+        <w:pBdr>
+          <w:top w:space="0" w:sz="0" w:val="nil"/>
+          <w:left w:space="0" w:sz="0" w:val="nil"/>
+          <w:bottom w:space="0" w:sz="0" w:val="nil"/>
+          <w:right w:space="0" w:sz="0" w:val="nil"/>
+          <w:between w:space="0" w:sz="0" w:val="nil"/>
+        </w:pBdr>
+        <w:shd w:fill="auto" w:val="clear"/>
+        <w:spacing w:after="0" w:before="0" w:line="259" w:lineRule="auto"/>
+        <w:ind w:left="720" w:right="0" w:hanging="360"/>
+        <w:jc w:val="left"/>
+        <w:rPr/>
+      </w:pPr>
+      <w:r>
+        <w:rPr>
+          <w:rFonts w:ascii="Calibri" w:cs="Calibri" w:eastAsia="Calibri" w:hAnsi="Calibri"/>
+          <w:b w:val="0"/>
+          <w:bCs w:val="0"/>
+          <w:i w:val="0"/>
+          <w:iCs w:val="0"/>
+          <w:smallCaps w:val="0"/>
+          <w:strike w:val="0"/>
+          <w:color w:val="000000"/>
+          <w:sz w:val="22"/>
+          <w:szCs w:val="22"/>
+          <w:u w:val="none"/>
+          <w:shd w:fill="auto" w:val="clear"/>
+          <w:vertAlign w:val="baseline"/>
+          <w:rtl w:val="0"/>
+        </w:rPr>
+        <w:t xml:space="preserve">En modo GhostMan, el fantasma del jugador arranca dentro de la base y sale cuando el jugador lo mueve hacia la puerta.</w:t>
+      </w:r>
+    </w:p>
+    <w:p>
+      <w:pPr>
+        <w:keepNext w:val="0"/>
+        <w:keepLines w:val="0"/>
+        <w:pageBreakBefore w:val="0"/>
+        <w:widowControl w:val="1"/>
+        <w:numPr>
+          <w:ilvl w:val="0"/>
+          <w:numId w:val="38"/>
+        </w:numPr>
+        <w:pBdr>
+          <w:top w:space="0" w:sz="0" w:val="nil"/>
+          <w:left w:space="0" w:sz="0" w:val="nil"/>
+          <w:bottom w:space="0" w:sz="0" w:val="nil"/>
+          <w:right w:space="0" w:sz="0" w:val="nil"/>
+          <w:between w:space="0" w:sz="0" w:val="nil"/>
+        </w:pBdr>
+        <w:shd w:fill="auto" w:val="clear"/>
+        <w:spacing w:after="0" w:before="0" w:line="259" w:lineRule="auto"/>
+        <w:ind w:left="720" w:right="0" w:hanging="360"/>
+        <w:jc w:val="left"/>
+        <w:rPr/>
+      </w:pPr>
+      <w:r>
+        <w:rPr>
+          <w:rFonts w:ascii="Calibri" w:cs="Calibri" w:eastAsia="Calibri" w:hAnsi="Calibri"/>
+          <w:b w:val="0"/>
+          <w:bCs w:val="0"/>
+          <w:i w:val="0"/>
+          <w:iCs w:val="0"/>
+          <w:smallCaps w:val="0"/>
+          <w:strike w:val="0"/>
+          <w:color w:val="000000"/>
+          <w:sz w:val="22"/>
+          <w:szCs w:val="22"/>
+          <w:u w:val="none"/>
+          <w:shd w:fill="auto" w:val="clear"/>
+          <w:vertAlign w:val="baseline"/>
+          <w:rtl w:val="0"/>
+        </w:rPr>
+        <w:t xml:space="preserve">Un fantasma vivo no puede volver a entrar a la base.</w:t>
+      </w:r>
+    </w:p>
+    <w:p>
+      <w:pPr>
+        <w:keepNext w:val="0"/>
+        <w:keepLines w:val="0"/>
+        <w:pageBreakBefore w:val="0"/>
+        <w:widowControl w:val="1"/>
+        <w:numPr>
+          <w:ilvl w:val="0"/>
+          <w:numId w:val="38"/>
+        </w:numPr>
+        <w:pBdr>
+          <w:top w:space="0" w:sz="0" w:val="nil"/>
+          <w:left w:space="0" w:sz="0" w:val="nil"/>
+          <w:bottom w:space="0" w:sz="0" w:val="nil"/>
+          <w:right w:space="0" w:sz="0" w:val="nil"/>
+          <w:between w:space="0" w:sz="0" w:val="nil"/>
+        </w:pBdr>
+        <w:shd w:fill="auto" w:val="clear"/>
+        <w:spacing w:after="0" w:before="0" w:line="259" w:lineRule="auto"/>
+        <w:ind w:left="720" w:right="0" w:hanging="360"/>
+        <w:jc w:val="left"/>
+        <w:rPr/>
+      </w:pPr>
+      <w:r>
+        <w:rPr>
+          <w:rFonts w:ascii="Calibri" w:cs="Calibri" w:eastAsia="Calibri" w:hAnsi="Calibri"/>
+          <w:b w:val="0"/>
+          <w:bCs w:val="0"/>
+          <w:i w:val="0"/>
+          <w:iCs w:val="0"/>
+          <w:smallCaps w:val="0"/>
+          <w:strike w:val="0"/>
+          <w:color w:val="000000"/>
+          <w:sz w:val="22"/>
+          <w:szCs w:val="22"/>
+          <w:u w:val="none"/>
+          <w:shd w:fill="auto" w:val="clear"/>
+          <w:vertAlign w:val="baseline"/>
+          <w:rtl w:val="0"/>
+        </w:rPr>
+        <w:t xml:space="preserve">Un fantasma comido queda reducido a sus ojos, que vuelven solos a la base sin colisionar con nada.</w:t>
+      </w:r>
+    </w:p>
+    <w:p>
+      <w:pPr>
+        <w:keepNext w:val="0"/>
+        <w:keepLines w:val="0"/>
+        <w:pageBreakBefore w:val="0"/>
+        <w:widowControl w:val="1"/>
+        <w:numPr>
+          <w:ilvl w:val="0"/>
+          <w:numId w:val="38"/>
+        </w:numPr>
+        <w:pBdr>
+          <w:top w:space="0" w:sz="0" w:val="nil"/>
+          <w:left w:space="0" w:sz="0" w:val="nil"/>
+          <w:bottom w:space="0" w:sz="0" w:val="nil"/>
+          <w:right w:space="0" w:sz="0" w:val="nil"/>
+          <w:between w:space="0" w:sz="0" w:val="nil"/>
+        </w:pBdr>
+        <w:shd w:fill="auto" w:val="clear"/>
+        <w:spacing w:after="0" w:before="0" w:line="259" w:lineRule="auto"/>
+        <w:ind w:left="720" w:right="0" w:hanging="360"/>
+        <w:jc w:val="left"/>
+        <w:rPr/>
+      </w:pPr>
+      <w:r>
+        <w:rPr>
+          <w:rFonts w:ascii="Calibri" w:cs="Calibri" w:eastAsia="Calibri" w:hAnsi="Calibri"/>
+          <w:b w:val="0"/>
+          <w:bCs w:val="0"/>
+          <w:i w:val="0"/>
+          <w:iCs w:val="0"/>
+          <w:smallCaps w:val="0"/>
+          <w:strike w:val="0"/>
+          <w:color w:val="000000"/>
+          <w:sz w:val="22"/>
+          <w:szCs w:val="22"/>
+          <w:u w:val="none"/>
+          <w:shd w:fill="auto" w:val="clear"/>
+          <w:vertAlign w:val="baseline"/>
+          <w:rtl w:val="0"/>
+        </w:rPr>
+        <w:t xml:space="preserve">Al entrar a la base, el fantasma revive y vuelve a salir. El naval espera 3 segundos adentro antes de salir.</w:t>
+      </w:r>
+    </w:p>
+    <w:p>
+      <w:pPr>
+        <w:keepNext w:val="0"/>
+        <w:keepLines w:val="0"/>
+        <w:pageBreakBefore w:val="0"/>
+        <w:widowControl w:val="1"/>
+        <w:numPr>
+          <w:ilvl w:val="0"/>
+          <w:numId w:val="38"/>
+        </w:numPr>
+        <w:pBdr>
+          <w:top w:space="0" w:sz="0" w:val="nil"/>
+          <w:left w:space="0" w:sz="0" w:val="nil"/>
+          <w:bottom w:space="0" w:sz="0" w:val="nil"/>
+          <w:right w:space="0" w:sz="0" w:val="nil"/>
+          <w:between w:space="0" w:sz="0" w:val="nil"/>
+        </w:pBdr>
+        <w:shd w:fill="auto" w:val="clear"/>
+        <w:spacing w:after="0" w:before="0" w:line="259" w:lineRule="auto"/>
+        <w:ind w:left="720" w:right="0" w:hanging="360"/>
+        <w:jc w:val="left"/>
+        <w:rPr/>
+      </w:pPr>
+      <w:r>
+        <w:rPr>
+          <w:rFonts w:ascii="Calibri" w:cs="Calibri" w:eastAsia="Calibri" w:hAnsi="Calibri"/>
+          <w:b w:val="0"/>
+          <w:bCs w:val="0"/>
+          <w:i w:val="0"/>
+          <w:iCs w:val="0"/>
+          <w:smallCaps w:val="0"/>
+          <w:strike w:val="0"/>
+          <w:color w:val="000000"/>
+          <w:sz w:val="22"/>
+          <w:szCs w:val="22"/>
+          <w:u w:val="none"/>
+          <w:shd w:fill="auto" w:val="clear"/>
+          <w:vertAlign w:val="baseline"/>
+          <w:rtl w:val="0"/>
+        </w:rPr>
+        <w:t xml:space="preserve">Si un jugador de fantasma no mueve a su fantasma, Pacman termina completando el nivel.</w:t>
+      </w:r>
+    </w:p>
+    <w:p>
+      <w:pPr>
+        <w:keepNext w:val="0"/>
+        <w:keepLines w:val="0"/>
+        <w:pageBreakBefore w:val="0"/>
+        <w:widowControl w:val="1"/>
+        <w:numPr>
+          <w:ilvl w:val="0"/>
+          <w:numId w:val="38"/>
+        </w:numPr>
+        <w:pBdr>
+          <w:top w:space="0" w:sz="0" w:val="nil"/>
+          <w:left w:space="0" w:sz="0" w:val="nil"/>
+          <w:bottom w:space="0" w:sz="0" w:val="nil"/>
+          <w:right w:space="0" w:sz="0" w:val="nil"/>
+          <w:between w:space="0" w:sz="0" w:val="nil"/>
+        </w:pBdr>
+        <w:shd w:fill="auto" w:val="clear"/>
+        <w:spacing w:after="0" w:before="0" w:line="259" w:lineRule="auto"/>
+        <w:ind w:left="720" w:right="0" w:hanging="360"/>
+        <w:jc w:val="left"/>
+        <w:rPr/>
+      </w:pPr>
+      <w:r>
+        <w:rPr>
+          <w:rFonts w:ascii="Calibri" w:cs="Calibri" w:eastAsia="Calibri" w:hAnsi="Calibri"/>
+          <w:b w:val="0"/>
+          <w:bCs w:val="0"/>
+          <w:i w:val="0"/>
+          <w:iCs w:val="0"/>
+          <w:smallCaps w:val="0"/>
+          <w:strike w:val="0"/>
+          <w:color w:val="000000"/>
+          <w:sz w:val="22"/>
+          <w:szCs w:val="22"/>
+          <w:u w:val="none"/>
+          <w:shd w:fill="auto" w:val="clear"/>
+          <w:vertAlign w:val="baseline"/>
+          <w:rtl w:val="0"/>
+        </w:rPr>
+        <w:t xml:space="preserve">Cada nivel tiene su propio laberinto, con muros de una celda de espesor en la mayor parte del mapa.</w:t>
+      </w:r>
+    </w:p>
+    <w:p>
+      <w:pPr>
+        <w:pStyle w:val="Heading4"/>
+        <w:rPr/>
+      </w:pPr>
+      <w:r>
+        <w:rPr>
+          <w:rtl w:val="0"/>
+        </w:rPr>
+        <w:t xml:space="preserve">HU-45 · Cruzar el mapa por el túnel</w:t>
+      </w:r>
+    </w:p>
+    <w:p>
+      <w:pPr>
+        <w:rPr/>
+      </w:pPr>
+      <w:r>
+        <w:rPr>
+          <w:i w:val="1"/>
+          <w:iCs w:val="1"/>
+          <w:rtl w:val="0"/>
+        </w:rPr>
+        <w:t xml:space="preserve">Épica: E12 · Versión: V3 · Prioridad: Alta</w:t>
+      </w:r>
+      <w:r>
+        <w:rPr>
+          <w:rtl w:val="0"/>
+        </w:rPr>
+      </w:r>
+    </w:p>
+    <w:p>
+      <w:pPr>
+        <w:rPr/>
+      </w:pPr>
+      <w:r>
+        <w:rPr>
+          <w:b w:val="1"/>
+          <w:bCs w:val="1"/>
+          <w:rtl w:val="0"/>
+        </w:rPr>
+        <w:t xml:space="preserve">Como</w:t>
+      </w:r>
+      <w:r>
+        <w:rPr>
+          <w:rtl w:val="0"/>
+        </w:rPr>
+        <w:t xml:space="preserve"> jugador </w:t>
+      </w:r>
+      <w:r>
+        <w:rPr>
+          <w:b w:val="1"/>
+          <w:bCs w:val="1"/>
+          <w:rtl w:val="0"/>
+        </w:rPr>
+        <w:t xml:space="preserve">quiero</w:t>
+      </w:r>
+      <w:r>
+        <w:rPr>
+          <w:rtl w:val="0"/>
+        </w:rPr>
+        <w:t xml:space="preserve"> salir por un borde del mapa y entrar por el opuesto a través de un túnel </w:t>
+      </w:r>
+      <w:r>
+        <w:rPr>
+          <w:b w:val="1"/>
+          <w:bCs w:val="1"/>
+          <w:rtl w:val="0"/>
+        </w:rPr>
+        <w:t xml:space="preserve">para</w:t>
+      </w:r>
+      <w:r>
+        <w:rPr>
+          <w:rtl w:val="0"/>
+        </w:rPr>
+        <w:t xml:space="preserve"> escapar o perseguir tomando un atajo, como en el Pac-Man clásico.</w:t>
+      </w:r>
+    </w:p>
+    <w:p>
+      <w:pPr>
+        <w:rPr/>
+      </w:pPr>
+      <w:r>
+        <w:rPr>
+          <w:b w:val="1"/>
+          <w:bCs w:val="1"/>
+          <w:rtl w:val="0"/>
+        </w:rPr>
+        <w:t xml:space="preserve">Criterios de aceptación:</w:t>
+      </w:r>
+      <w:r>
+        <w:rPr>
+          <w:rtl w:val="0"/>
+        </w:rPr>
+      </w:r>
+    </w:p>
+    <w:p>
+      <w:pPr>
+        <w:keepNext w:val="0"/>
+        <w:keepLines w:val="0"/>
+        <w:pageBreakBefore w:val="0"/>
+        <w:widowControl w:val="1"/>
+        <w:numPr>
+          <w:ilvl w:val="0"/>
+          <w:numId w:val="38"/>
+        </w:numPr>
+        <w:pBdr>
+          <w:top w:space="0" w:sz="0" w:val="nil"/>
+          <w:left w:space="0" w:sz="0" w:val="nil"/>
+          <w:bottom w:space="0" w:sz="0" w:val="nil"/>
+          <w:right w:space="0" w:sz="0" w:val="nil"/>
+          <w:between w:space="0" w:sz="0" w:val="nil"/>
+        </w:pBdr>
+        <w:shd w:fill="auto" w:val="clear"/>
+        <w:spacing w:after="0" w:before="0" w:line="259" w:lineRule="auto"/>
+        <w:ind w:left="720" w:right="0" w:hanging="360"/>
+        <w:jc w:val="left"/>
+        <w:rPr/>
+      </w:pPr>
+      <w:r>
+        <w:rPr>
+          <w:rFonts w:ascii="Calibri" w:cs="Calibri" w:eastAsia="Calibri" w:hAnsi="Calibri"/>
+          <w:b w:val="0"/>
+          <w:bCs w:val="0"/>
+          <w:i w:val="0"/>
+          <w:iCs w:val="0"/>
+          <w:smallCaps w:val="0"/>
+          <w:strike w:val="0"/>
+          <w:color w:val="000000"/>
+          <w:sz w:val="22"/>
+          <w:szCs w:val="22"/>
+          <w:u w:val="none"/>
+          <w:shd w:fill="auto" w:val="clear"/>
+          <w:vertAlign w:val="baseline"/>
+          <w:rtl w:val="0"/>
+        </w:rPr>
+        <w:t xml:space="preserve">Los tres niveles tienen un túnel en la misma fila, que conecta el borde izquierdo con el derecho.</w:t>
+      </w:r>
+    </w:p>
+    <w:p>
+      <w:pPr>
+        <w:keepNext w:val="0"/>
+        <w:keepLines w:val="0"/>
+        <w:pageBreakBefore w:val="0"/>
+        <w:widowControl w:val="1"/>
+        <w:numPr>
+          <w:ilvl w:val="0"/>
+          <w:numId w:val="38"/>
+        </w:numPr>
+        <w:pBdr>
+          <w:top w:space="0" w:sz="0" w:val="nil"/>
+          <w:left w:space="0" w:sz="0" w:val="nil"/>
+          <w:bottom w:space="0" w:sz="0" w:val="nil"/>
+          <w:right w:space="0" w:sz="0" w:val="nil"/>
+          <w:between w:space="0" w:sz="0" w:val="nil"/>
+        </w:pBdr>
+        <w:shd w:fill="auto" w:val="clear"/>
+        <w:spacing w:after="0" w:before="0" w:line="259" w:lineRule="auto"/>
+        <w:ind w:left="720" w:right="0" w:hanging="360"/>
+        <w:jc w:val="left"/>
+        <w:rPr/>
+      </w:pPr>
+      <w:r>
+        <w:rPr>
+          <w:rFonts w:ascii="Calibri" w:cs="Calibri" w:eastAsia="Calibri" w:hAnsi="Calibri"/>
+          <w:b w:val="0"/>
+          <w:bCs w:val="0"/>
+          <w:i w:val="0"/>
+          <w:iCs w:val="0"/>
+          <w:smallCaps w:val="0"/>
+          <w:strike w:val="0"/>
+          <w:color w:val="000000"/>
+          <w:sz w:val="22"/>
+          <w:szCs w:val="22"/>
+          <w:u w:val="none"/>
+          <w:shd w:fill="auto" w:val="clear"/>
+          <w:vertAlign w:val="baseline"/>
+          <w:rtl w:val="0"/>
+        </w:rPr>
+        <w:t xml:space="preserve">Pacman y todos los fantasmas pueden cruzar el túnel en los dos sentidos.</w:t>
+      </w:r>
+    </w:p>
+    <w:p>
+      <w:pPr>
+        <w:keepNext w:val="0"/>
+        <w:keepLines w:val="0"/>
+        <w:pageBreakBefore w:val="0"/>
+        <w:widowControl w:val="1"/>
+        <w:numPr>
+          <w:ilvl w:val="0"/>
+          <w:numId w:val="38"/>
+        </w:numPr>
+        <w:pBdr>
+          <w:top w:space="0" w:sz="0" w:val="nil"/>
+          <w:left w:space="0" w:sz="0" w:val="nil"/>
+          <w:bottom w:space="0" w:sz="0" w:val="nil"/>
+          <w:right w:space="0" w:sz="0" w:val="nil"/>
+          <w:between w:space="0" w:sz="0" w:val="nil"/>
+        </w:pBdr>
+        <w:shd w:fill="auto" w:val="clear"/>
+        <w:spacing w:after="0" w:before="0" w:line="259" w:lineRule="auto"/>
+        <w:ind w:left="720" w:right="0" w:hanging="360"/>
+        <w:jc w:val="left"/>
+        <w:rPr/>
+      </w:pPr>
+      <w:r>
+        <w:rPr>
+          <w:rFonts w:ascii="Calibri" w:cs="Calibri" w:eastAsia="Calibri" w:hAnsi="Calibri"/>
+          <w:b w:val="0"/>
+          <w:bCs w:val="0"/>
+          <w:i w:val="0"/>
+          <w:iCs w:val="0"/>
+          <w:smallCaps w:val="0"/>
+          <w:strike w:val="0"/>
+          <w:color w:val="000000"/>
+          <w:sz w:val="22"/>
+          <w:szCs w:val="22"/>
+          <w:u w:val="none"/>
+          <w:shd w:fill="auto" w:val="clear"/>
+          <w:vertAlign w:val="baseline"/>
+          <w:rtl w:val="0"/>
+        </w:rPr>
+        <w:t xml:space="preserve">Al salir por un borde, el personaje aparece en el borde opuesto con la misma dirección de avance.</w:t>
+      </w:r>
+    </w:p>
+    <w:p>
+      <w:pPr>
+        <w:keepNext w:val="0"/>
+        <w:keepLines w:val="0"/>
+        <w:pageBreakBefore w:val="0"/>
+        <w:widowControl w:val="1"/>
+        <w:numPr>
+          <w:ilvl w:val="0"/>
+          <w:numId w:val="38"/>
+        </w:numPr>
+        <w:pBdr>
+          <w:top w:space="0" w:sz="0" w:val="nil"/>
+          <w:left w:space="0" w:sz="0" w:val="nil"/>
+          <w:bottom w:space="0" w:sz="0" w:val="nil"/>
+          <w:right w:space="0" w:sz="0" w:val="nil"/>
+          <w:between w:space="0" w:sz="0" w:val="nil"/>
+        </w:pBdr>
+        <w:shd w:fill="auto" w:val="clear"/>
+        <w:spacing w:after="0" w:before="0" w:line="259" w:lineRule="auto"/>
+        <w:ind w:left="720" w:right="0" w:hanging="360"/>
+        <w:jc w:val="left"/>
+        <w:rPr/>
+      </w:pPr>
+      <w:r>
+        <w:rPr>
+          <w:rFonts w:ascii="Calibri" w:cs="Calibri" w:eastAsia="Calibri" w:hAnsi="Calibri"/>
+          <w:b w:val="0"/>
+          <w:bCs w:val="0"/>
+          <w:i w:val="0"/>
+          <w:iCs w:val="0"/>
+          <w:smallCaps w:val="0"/>
+          <w:strike w:val="0"/>
+          <w:color w:val="000000"/>
+          <w:sz w:val="22"/>
+          <w:szCs w:val="22"/>
+          <w:u w:val="none"/>
+          <w:shd w:fill="auto" w:val="clear"/>
+          <w:vertAlign w:val="baseline"/>
+          <w:rtl w:val="0"/>
+        </w:rPr>
+        <w:t xml:space="preserve">Los fantasmas se desplazan al 50 % de su velocidad dentro del túnel; Pacman mantiene la suya.</w:t>
+      </w:r>
+    </w:p>
+    <w:p>
+      <w:pPr>
+        <w:keepNext w:val="0"/>
+        <w:keepLines w:val="0"/>
+        <w:pageBreakBefore w:val="0"/>
+        <w:widowControl w:val="1"/>
+        <w:numPr>
+          <w:ilvl w:val="0"/>
+          <w:numId w:val="38"/>
+        </w:numPr>
+        <w:pBdr>
+          <w:top w:space="0" w:sz="0" w:val="nil"/>
+          <w:left w:space="0" w:sz="0" w:val="nil"/>
+          <w:bottom w:space="0" w:sz="0" w:val="nil"/>
+          <w:right w:space="0" w:sz="0" w:val="nil"/>
+          <w:between w:space="0" w:sz="0" w:val="nil"/>
+        </w:pBdr>
+        <w:shd w:fill="auto" w:val="clear"/>
+        <w:spacing w:after="0" w:before="0" w:line="259" w:lineRule="auto"/>
+        <w:ind w:left="720" w:right="0" w:hanging="360"/>
+        <w:jc w:val="left"/>
+        <w:rPr/>
+      </w:pPr>
+      <w:r>
+        <w:rPr>
+          <w:rFonts w:ascii="Calibri" w:cs="Calibri" w:eastAsia="Calibri" w:hAnsi="Calibri"/>
+          <w:b w:val="0"/>
+          <w:bCs w:val="0"/>
+          <w:i w:val="0"/>
+          <w:iCs w:val="0"/>
+          <w:smallCaps w:val="0"/>
+          <w:strike w:val="0"/>
+          <w:color w:val="000000"/>
+          <w:sz w:val="22"/>
+          <w:szCs w:val="22"/>
+          <w:u w:val="none"/>
+          <w:shd w:fill="auto" w:val="clear"/>
+          <w:vertAlign w:val="baseline"/>
+          <w:rtl w:val="0"/>
+        </w:rPr>
+        <w:t xml:space="preserve">La IA de Pacman y la de los fantasmas usan el túnel al calcular sus recorridos.</w:t>
+      </w:r>
+    </w:p>
+    <w:p>
+      <w:pPr>
+        <w:keepNext w:val="0"/>
+        <w:keepLines w:val="0"/>
+        <w:pageBreakBefore w:val="0"/>
+        <w:widowControl w:val="1"/>
+        <w:numPr>
+          <w:ilvl w:val="0"/>
+          <w:numId w:val="38"/>
+        </w:numPr>
+        <w:pBdr>
+          <w:top w:space="0" w:sz="0" w:val="nil"/>
+          <w:left w:space="0" w:sz="0" w:val="nil"/>
+          <w:bottom w:space="0" w:sz="0" w:val="nil"/>
+          <w:right w:space="0" w:sz="0" w:val="nil"/>
+          <w:between w:space="0" w:sz="0" w:val="nil"/>
+        </w:pBdr>
+        <w:shd w:fill="auto" w:val="clear"/>
+        <w:spacing w:after="0" w:before="0" w:line="259" w:lineRule="auto"/>
+        <w:ind w:left="720" w:right="0" w:hanging="360"/>
+        <w:jc w:val="left"/>
+        <w:rPr/>
+      </w:pPr>
+      <w:r>
+        <w:rPr>
+          <w:rFonts w:ascii="Calibri" w:cs="Calibri" w:eastAsia="Calibri" w:hAnsi="Calibri"/>
+          <w:b w:val="0"/>
+          <w:bCs w:val="0"/>
+          <w:i w:val="0"/>
+          <w:iCs w:val="0"/>
+          <w:smallCaps w:val="0"/>
+          <w:strike w:val="0"/>
+          <w:color w:val="000000"/>
+          <w:sz w:val="22"/>
+          <w:szCs w:val="22"/>
+          <w:u w:val="none"/>
+          <w:shd w:fill="auto" w:val="clear"/>
+          <w:vertAlign w:val="baseline"/>
+          <w:rtl w:val="0"/>
+        </w:rPr>
+        <w:t xml:space="preserve">Ni las frutas reales ni las falsas aparecen dentro del túnel.</w:t>
+      </w:r>
+    </w:p>
+    <w:p>
+      <w:pPr>
+        <w:keepNext w:val="0"/>
+        <w:keepLines w:val="0"/>
+        <w:pageBreakBefore w:val="0"/>
+        <w:widowControl w:val="1"/>
+        <w:numPr>
+          <w:ilvl w:val="0"/>
+          <w:numId w:val="38"/>
+        </w:numPr>
+        <w:pBdr>
+          <w:top w:space="0" w:sz="0" w:val="nil"/>
+          <w:left w:space="0" w:sz="0" w:val="nil"/>
+          <w:bottom w:space="0" w:sz="0" w:val="nil"/>
+          <w:right w:space="0" w:sz="0" w:val="nil"/>
+          <w:between w:space="0" w:sz="0" w:val="nil"/>
+        </w:pBdr>
+        <w:shd w:fill="auto" w:val="clear"/>
+        <w:spacing w:after="0" w:before="0" w:line="259" w:lineRule="auto"/>
+        <w:ind w:left="720" w:right="0" w:hanging="360"/>
+        <w:jc w:val="left"/>
+        <w:rPr/>
+      </w:pPr>
+      <w:r>
+        <w:rPr>
+          <w:rFonts w:ascii="Calibri" w:cs="Calibri" w:eastAsia="Calibri" w:hAnsi="Calibri"/>
+          <w:b w:val="0"/>
+          <w:bCs w:val="0"/>
+          <w:i w:val="0"/>
+          <w:iCs w:val="0"/>
+          <w:smallCaps w:val="0"/>
+          <w:strike w:val="0"/>
+          <w:color w:val="000000"/>
+          <w:sz w:val="22"/>
+          <w:szCs w:val="22"/>
+          <w:u w:val="none"/>
+          <w:shd w:fill="auto" w:val="clear"/>
+          <w:vertAlign w:val="baseline"/>
+          <w:rtl w:val="0"/>
+        </w:rPr>
+        <w:t xml:space="preserve">Un personaje a mitad del cruce se ve recortado en un borde y asomando por el otro, sin tapar el HUD.</w:t>
+      </w:r>
+    </w:p>
+    <w:p>
+      <w:pPr>
+        <w:pStyle w:val="Heading4"/>
+        <w:rPr/>
+      </w:pPr>
+      <w:r>
+        <w:rPr>
+          <w:rtl w:val="0"/>
+        </w:rPr>
+        <w:t xml:space="preserve">HU-46 · Prepararme antes de que empiece el nivel</w:t>
+      </w:r>
+    </w:p>
+    <w:p>
+      <w:pPr>
+        <w:rPr/>
+      </w:pPr>
+      <w:r>
+        <w:rPr>
+          <w:i w:val="1"/>
+          <w:iCs w:val="1"/>
+          <w:rtl w:val="0"/>
+        </w:rPr>
+        <w:t xml:space="preserve">Épica: E12 · Versión: V3 · Prioridad: Media</w:t>
+      </w:r>
+      <w:r>
+        <w:rPr>
+          <w:rtl w:val="0"/>
+        </w:rPr>
+      </w:r>
+    </w:p>
+    <w:p>
+      <w:pPr>
+        <w:rPr/>
+      </w:pPr>
+      <w:r>
+        <w:rPr>
+          <w:b w:val="1"/>
+          <w:bCs w:val="1"/>
+          <w:rtl w:val="0"/>
+        </w:rPr>
+        <w:t xml:space="preserve">Como</w:t>
+      </w:r>
+      <w:r>
+        <w:rPr>
+          <w:rtl w:val="0"/>
+        </w:rPr>
+        <w:t xml:space="preserve"> jugador </w:t>
+      </w:r>
+      <w:r>
+        <w:rPr>
+          <w:b w:val="1"/>
+          <w:bCs w:val="1"/>
+          <w:rtl w:val="0"/>
+        </w:rPr>
+        <w:t xml:space="preserve">quiero</w:t>
+      </w:r>
+      <w:r>
+        <w:rPr>
+          <w:rtl w:val="0"/>
+        </w:rPr>
+        <w:t xml:space="preserve"> ver una cuenta regresiva antes de que empiece cada nivel </w:t>
+      </w:r>
+      <w:r>
+        <w:rPr>
+          <w:b w:val="1"/>
+          <w:bCs w:val="1"/>
+          <w:rtl w:val="0"/>
+        </w:rPr>
+        <w:t xml:space="preserve">para</w:t>
+      </w:r>
+      <w:r>
+        <w:rPr>
+          <w:rtl w:val="0"/>
+        </w:rPr>
+        <w:t xml:space="preserve"> tener tiempo de ubicarme en el mapa antes de que todo se mueva.</w:t>
+      </w:r>
+    </w:p>
+    <w:p>
+      <w:pPr>
+        <w:rPr/>
+      </w:pPr>
+      <w:r>
+        <w:rPr>
+          <w:b w:val="1"/>
+          <w:bCs w:val="1"/>
+          <w:rtl w:val="0"/>
+        </w:rPr>
+        <w:t xml:space="preserve">Criterios de aceptación:</w:t>
+      </w:r>
+      <w:r>
+        <w:rPr>
+          <w:rtl w:val="0"/>
+        </w:rPr>
+      </w:r>
+    </w:p>
+    <w:p>
+      <w:pPr>
+        <w:keepNext w:val="0"/>
+        <w:keepLines w:val="0"/>
+        <w:pageBreakBefore w:val="0"/>
+        <w:widowControl w:val="1"/>
+        <w:numPr>
+          <w:ilvl w:val="0"/>
+          <w:numId w:val="38"/>
+        </w:numPr>
+        <w:pBdr>
+          <w:top w:space="0" w:sz="0" w:val="nil"/>
+          <w:left w:space="0" w:sz="0" w:val="nil"/>
+          <w:bottom w:space="0" w:sz="0" w:val="nil"/>
+          <w:right w:space="0" w:sz="0" w:val="nil"/>
+          <w:between w:space="0" w:sz="0" w:val="nil"/>
+        </w:pBdr>
+        <w:shd w:fill="auto" w:val="clear"/>
+        <w:spacing w:after="0" w:before="0" w:line="259" w:lineRule="auto"/>
+        <w:ind w:left="720" w:right="0" w:hanging="360"/>
+        <w:jc w:val="left"/>
+        <w:rPr/>
+      </w:pPr>
+      <w:r>
+        <w:rPr>
+          <w:rFonts w:ascii="Calibri" w:cs="Calibri" w:eastAsia="Calibri" w:hAnsi="Calibri"/>
+          <w:b w:val="0"/>
+          <w:bCs w:val="0"/>
+          <w:i w:val="0"/>
+          <w:iCs w:val="0"/>
+          <w:smallCaps w:val="0"/>
+          <w:strike w:val="0"/>
+          <w:color w:val="000000"/>
+          <w:sz w:val="22"/>
+          <w:szCs w:val="22"/>
+          <w:u w:val="none"/>
+          <w:shd w:fill="auto" w:val="clear"/>
+          <w:vertAlign w:val="baseline"/>
+          <w:rtl w:val="0"/>
+        </w:rPr>
+        <w:t xml:space="preserve">Al inicio de cada nivel, en los dos modos, se muestra "3", "2", "1" y "¡ya!", con 1 segundo por número y medio segundo para "¡ya!".</w:t>
+      </w:r>
+    </w:p>
+    <w:p>
+      <w:pPr>
+        <w:keepNext w:val="0"/>
+        <w:keepLines w:val="0"/>
+        <w:pageBreakBefore w:val="0"/>
+        <w:widowControl w:val="1"/>
+        <w:numPr>
+          <w:ilvl w:val="0"/>
+          <w:numId w:val="38"/>
+        </w:numPr>
+        <w:pBdr>
+          <w:top w:space="0" w:sz="0" w:val="nil"/>
+          <w:left w:space="0" w:sz="0" w:val="nil"/>
+          <w:bottom w:space="0" w:sz="0" w:val="nil"/>
+          <w:right w:space="0" w:sz="0" w:val="nil"/>
+          <w:between w:space="0" w:sz="0" w:val="nil"/>
+        </w:pBdr>
+        <w:shd w:fill="auto" w:val="clear"/>
+        <w:spacing w:after="0" w:before="0" w:line="259" w:lineRule="auto"/>
+        <w:ind w:left="720" w:right="0" w:hanging="360"/>
+        <w:jc w:val="left"/>
+        <w:rPr/>
+      </w:pPr>
+      <w:r>
+        <w:rPr>
+          <w:rFonts w:ascii="Calibri" w:cs="Calibri" w:eastAsia="Calibri" w:hAnsi="Calibri"/>
+          <w:b w:val="0"/>
+          <w:bCs w:val="0"/>
+          <w:i w:val="0"/>
+          <w:iCs w:val="0"/>
+          <w:smallCaps w:val="0"/>
+          <w:strike w:val="0"/>
+          <w:color w:val="000000"/>
+          <w:sz w:val="22"/>
+          <w:szCs w:val="22"/>
+          <w:u w:val="none"/>
+          <w:shd w:fill="auto" w:val="clear"/>
+          <w:vertAlign w:val="baseline"/>
+          <w:rtl w:val="0"/>
+        </w:rPr>
+        <w:t xml:space="preserve">Después de perder una vida se muestra "¡Listo!" durante 2 segundos antes de continuar.</w:t>
+      </w:r>
+    </w:p>
+    <w:p>
+      <w:pPr>
+        <w:keepNext w:val="0"/>
+        <w:keepLines w:val="0"/>
+        <w:pageBreakBefore w:val="0"/>
+        <w:widowControl w:val="1"/>
+        <w:numPr>
+          <w:ilvl w:val="0"/>
+          <w:numId w:val="38"/>
+        </w:numPr>
+        <w:pBdr>
+          <w:top w:space="0" w:sz="0" w:val="nil"/>
+          <w:left w:space="0" w:sz="0" w:val="nil"/>
+          <w:bottom w:space="0" w:sz="0" w:val="nil"/>
+          <w:right w:space="0" w:sz="0" w:val="nil"/>
+          <w:between w:space="0" w:sz="0" w:val="nil"/>
+        </w:pBdr>
+        <w:shd w:fill="auto" w:val="clear"/>
+        <w:spacing w:after="0" w:before="0" w:line="259" w:lineRule="auto"/>
+        <w:ind w:left="720" w:right="0" w:hanging="360"/>
+        <w:jc w:val="left"/>
+        <w:rPr/>
+      </w:pPr>
+      <w:r>
+        <w:rPr>
+          <w:rFonts w:ascii="Calibri" w:cs="Calibri" w:eastAsia="Calibri" w:hAnsi="Calibri"/>
+          <w:b w:val="0"/>
+          <w:bCs w:val="0"/>
+          <w:i w:val="0"/>
+          <w:iCs w:val="0"/>
+          <w:smallCaps w:val="0"/>
+          <w:strike w:val="0"/>
+          <w:color w:val="000000"/>
+          <w:sz w:val="22"/>
+          <w:szCs w:val="22"/>
+          <w:u w:val="none"/>
+          <w:shd w:fill="auto" w:val="clear"/>
+          <w:vertAlign w:val="baseline"/>
+          <w:rtl w:val="0"/>
+        </w:rPr>
+        <w:t xml:space="preserve">Durante la cuenta ningún personaje se mueve y ningún temporizador avanza: ni el bonus por tiempo, ni los cooldowns, ni las frutas, ni la salida de la base.</w:t>
+      </w:r>
+    </w:p>
+    <w:p>
+      <w:pPr>
+        <w:keepNext w:val="0"/>
+        <w:keepLines w:val="0"/>
+        <w:pageBreakBefore w:val="0"/>
+        <w:widowControl w:val="1"/>
+        <w:numPr>
+          <w:ilvl w:val="0"/>
+          <w:numId w:val="38"/>
+        </w:numPr>
+        <w:pBdr>
+          <w:top w:space="0" w:sz="0" w:val="nil"/>
+          <w:left w:space="0" w:sz="0" w:val="nil"/>
+          <w:bottom w:space="0" w:sz="0" w:val="nil"/>
+          <w:right w:space="0" w:sz="0" w:val="nil"/>
+          <w:between w:space="0" w:sz="0" w:val="nil"/>
+        </w:pBdr>
+        <w:shd w:fill="auto" w:val="clear"/>
+        <w:spacing w:after="0" w:before="0" w:line="259" w:lineRule="auto"/>
+        <w:ind w:left="720" w:right="0" w:hanging="360"/>
+        <w:jc w:val="left"/>
+        <w:rPr/>
+      </w:pPr>
+      <w:r>
+        <w:rPr>
+          <w:rFonts w:ascii="Calibri" w:cs="Calibri" w:eastAsia="Calibri" w:hAnsi="Calibri"/>
+          <w:b w:val="0"/>
+          <w:bCs w:val="0"/>
+          <w:i w:val="0"/>
+          <w:iCs w:val="0"/>
+          <w:smallCaps w:val="0"/>
+          <w:strike w:val="0"/>
+          <w:color w:val="000000"/>
+          <w:sz w:val="22"/>
+          <w:szCs w:val="22"/>
+          <w:u w:val="none"/>
+          <w:shd w:fill="auto" w:val="clear"/>
+          <w:vertAlign w:val="baseline"/>
+          <w:rtl w:val="0"/>
+        </w:rPr>
+        <w:t xml:space="preserve">Las teclas presionadas durante la cuenta no mueven a ningún personaje.</w:t>
+      </w:r>
+    </w:p>
+    <w:p>
+      <w:pPr>
+        <w:keepNext w:val="0"/>
+        <w:keepLines w:val="0"/>
+        <w:pageBreakBefore w:val="0"/>
+        <w:widowControl w:val="1"/>
+        <w:numPr>
+          <w:ilvl w:val="0"/>
+          <w:numId w:val="38"/>
+        </w:numPr>
+        <w:pBdr>
+          <w:top w:space="0" w:sz="0" w:val="nil"/>
+          <w:left w:space="0" w:sz="0" w:val="nil"/>
+          <w:bottom w:space="0" w:sz="0" w:val="nil"/>
+          <w:right w:space="0" w:sz="0" w:val="nil"/>
+          <w:between w:space="0" w:sz="0" w:val="nil"/>
+        </w:pBdr>
+        <w:shd w:fill="auto" w:val="clear"/>
+        <w:spacing w:after="0" w:before="0" w:line="259" w:lineRule="auto"/>
+        <w:ind w:left="720" w:right="0" w:hanging="360"/>
+        <w:jc w:val="left"/>
+        <w:rPr/>
+      </w:pPr>
+      <w:r>
+        <w:rPr>
+          <w:rFonts w:ascii="Calibri" w:cs="Calibri" w:eastAsia="Calibri" w:hAnsi="Calibri"/>
+          <w:b w:val="0"/>
+          <w:bCs w:val="0"/>
+          <w:i w:val="0"/>
+          <w:iCs w:val="0"/>
+          <w:smallCaps w:val="0"/>
+          <w:strike w:val="0"/>
+          <w:color w:val="000000"/>
+          <w:sz w:val="22"/>
+          <w:szCs w:val="22"/>
+          <w:u w:val="none"/>
+          <w:shd w:fill="auto" w:val="clear"/>
+          <w:vertAlign w:val="baseline"/>
+          <w:rtl w:val="0"/>
+        </w:rPr>
+        <w:t xml:space="preserve">Si el jugador pausa durante la cuenta, la cuenta se detiene y se reanuda al quitar la pausa.</w:t>
+      </w:r>
+    </w:p>
+    <w:p>
+      <w:pPr>
+        <w:pStyle w:val="Heading4"/>
+        <w:rPr/>
+      </w:pPr>
+      <w:r>
+        <w:rPr>
+          <w:rtl w:val="0"/>
+        </w:rPr>
+        <w:t xml:space="preserve">HU-47 · Ver la derrota de Pacman</w:t>
+      </w:r>
+    </w:p>
+    <w:p>
+      <w:pPr>
+        <w:rPr/>
+      </w:pPr>
+      <w:r>
+        <w:rPr>
+          <w:i w:val="1"/>
+          <w:iCs w:val="1"/>
+          <w:rtl w:val="0"/>
+        </w:rPr>
+        <w:t xml:space="preserve">Épica: E12 · Versión: V3 · Prioridad: Baja</w:t>
+      </w:r>
+      <w:r>
+        <w:rPr>
+          <w:rtl w:val="0"/>
+        </w:rPr>
+      </w:r>
+    </w:p>
+    <w:p>
+      <w:pPr>
+        <w:rPr/>
+      </w:pPr>
+      <w:r>
+        <w:rPr>
+          <w:b w:val="1"/>
+          <w:bCs w:val="1"/>
+          <w:rtl w:val="0"/>
+        </w:rPr>
+        <w:t xml:space="preserve">Como</w:t>
+      </w:r>
+      <w:r>
+        <w:rPr>
+          <w:rtl w:val="0"/>
+        </w:rPr>
+        <w:t xml:space="preserve"> jugador </w:t>
+      </w:r>
+      <w:r>
+        <w:rPr>
+          <w:b w:val="1"/>
+          <w:bCs w:val="1"/>
+          <w:rtl w:val="0"/>
+        </w:rPr>
+        <w:t xml:space="preserve">quiero</w:t>
+      </w:r>
+      <w:r>
+        <w:rPr>
+          <w:rtl w:val="0"/>
+        </w:rPr>
+        <w:t xml:space="preserve"> ver a Pacman desarmarse cuando lo derrotan </w:t>
+      </w:r>
+      <w:r>
+        <w:rPr>
+          <w:b w:val="1"/>
+          <w:bCs w:val="1"/>
+          <w:rtl w:val="0"/>
+        </w:rPr>
+        <w:t xml:space="preserve">para</w:t>
+      </w:r>
+      <w:r>
+        <w:rPr>
+          <w:rtl w:val="0"/>
+        </w:rPr>
+        <w:t xml:space="preserve"> reconocer al instante que perdió una vida, como en el juego clásico.</w:t>
+      </w:r>
+    </w:p>
+    <w:p>
+      <w:pPr>
+        <w:rPr/>
+      </w:pPr>
+      <w:r>
+        <w:rPr>
+          <w:b w:val="1"/>
+          <w:bCs w:val="1"/>
+          <w:rtl w:val="0"/>
+        </w:rPr>
+        <w:t xml:space="preserve">Criterios de aceptación:</w:t>
+      </w:r>
+      <w:r>
+        <w:rPr>
+          <w:rtl w:val="0"/>
+        </w:rPr>
+      </w:r>
+    </w:p>
+    <w:p>
+      <w:pPr>
+        <w:keepNext w:val="0"/>
+        <w:keepLines w:val="0"/>
+        <w:pageBreakBefore w:val="0"/>
+        <w:widowControl w:val="1"/>
+        <w:numPr>
+          <w:ilvl w:val="0"/>
+          <w:numId w:val="38"/>
+        </w:numPr>
+        <w:pBdr>
+          <w:top w:space="0" w:sz="0" w:val="nil"/>
+          <w:left w:space="0" w:sz="0" w:val="nil"/>
+          <w:bottom w:space="0" w:sz="0" w:val="nil"/>
+          <w:right w:space="0" w:sz="0" w:val="nil"/>
+          <w:between w:space="0" w:sz="0" w:val="nil"/>
+        </w:pBdr>
+        <w:shd w:fill="auto" w:val="clear"/>
+        <w:spacing w:after="0" w:before="0" w:line="259" w:lineRule="auto"/>
+        <w:ind w:left="720" w:right="0" w:hanging="360"/>
+        <w:jc w:val="left"/>
+        <w:rPr/>
+      </w:pPr>
+      <w:r>
+        <w:rPr>
+          <w:rFonts w:ascii="Calibri" w:cs="Calibri" w:eastAsia="Calibri" w:hAnsi="Calibri"/>
+          <w:b w:val="0"/>
+          <w:bCs w:val="0"/>
+          <w:i w:val="0"/>
+          <w:iCs w:val="0"/>
+          <w:smallCaps w:val="0"/>
+          <w:strike w:val="0"/>
+          <w:color w:val="000000"/>
+          <w:sz w:val="22"/>
+          <w:szCs w:val="22"/>
+          <w:u w:val="none"/>
+          <w:shd w:fill="auto" w:val="clear"/>
+          <w:vertAlign w:val="baseline"/>
+          <w:rtl w:val="0"/>
+        </w:rPr>
+        <w:t xml:space="preserve">Cuando Pacman pierde una vida, el juego queda congelado medio segundo con los fantasmas visibles.</w:t>
+      </w:r>
+    </w:p>
+    <w:p>
+      <w:pPr>
+        <w:keepNext w:val="0"/>
+        <w:keepLines w:val="0"/>
+        <w:pageBreakBefore w:val="0"/>
+        <w:widowControl w:val="1"/>
+        <w:numPr>
+          <w:ilvl w:val="0"/>
+          <w:numId w:val="38"/>
+        </w:numPr>
+        <w:pBdr>
+          <w:top w:space="0" w:sz="0" w:val="nil"/>
+          <w:left w:space="0" w:sz="0" w:val="nil"/>
+          <w:bottom w:space="0" w:sz="0" w:val="nil"/>
+          <w:right w:space="0" w:sz="0" w:val="nil"/>
+          <w:between w:space="0" w:sz="0" w:val="nil"/>
+        </w:pBdr>
+        <w:shd w:fill="auto" w:val="clear"/>
+        <w:spacing w:after="0" w:before="0" w:line="259" w:lineRule="auto"/>
+        <w:ind w:left="720" w:right="0" w:hanging="360"/>
+        <w:jc w:val="left"/>
+        <w:rPr/>
+      </w:pPr>
+      <w:r>
+        <w:rPr>
+          <w:rFonts w:ascii="Calibri" w:cs="Calibri" w:eastAsia="Calibri" w:hAnsi="Calibri"/>
+          <w:b w:val="0"/>
+          <w:bCs w:val="0"/>
+          <w:i w:val="0"/>
+          <w:iCs w:val="0"/>
+          <w:smallCaps w:val="0"/>
+          <w:strike w:val="0"/>
+          <w:color w:val="000000"/>
+          <w:sz w:val="22"/>
+          <w:szCs w:val="22"/>
+          <w:u w:val="none"/>
+          <w:shd w:fill="auto" w:val="clear"/>
+          <w:vertAlign w:val="baseline"/>
+          <w:rtl w:val="0"/>
+        </w:rPr>
+        <w:t xml:space="preserve">Después, los fantasmas desaparecen y Pacman se desarma hasta desaparecer, en 1,5 segundos, con su sonido.</w:t>
+      </w:r>
+    </w:p>
+    <w:p>
+      <w:pPr>
+        <w:keepNext w:val="0"/>
+        <w:keepLines w:val="0"/>
+        <w:pageBreakBefore w:val="0"/>
+        <w:widowControl w:val="1"/>
+        <w:numPr>
+          <w:ilvl w:val="0"/>
+          <w:numId w:val="38"/>
+        </w:numPr>
+        <w:pBdr>
+          <w:top w:space="0" w:sz="0" w:val="nil"/>
+          <w:left w:space="0" w:sz="0" w:val="nil"/>
+          <w:bottom w:space="0" w:sz="0" w:val="nil"/>
+          <w:right w:space="0" w:sz="0" w:val="nil"/>
+          <w:between w:space="0" w:sz="0" w:val="nil"/>
+        </w:pBdr>
+        <w:shd w:fill="auto" w:val="clear"/>
+        <w:spacing w:after="0" w:before="0" w:line="259" w:lineRule="auto"/>
+        <w:ind w:left="720" w:right="0" w:hanging="360"/>
+        <w:jc w:val="left"/>
+        <w:rPr/>
+      </w:pPr>
+      <w:r>
+        <w:rPr>
+          <w:rFonts w:ascii="Calibri" w:cs="Calibri" w:eastAsia="Calibri" w:hAnsi="Calibri"/>
+          <w:b w:val="0"/>
+          <w:bCs w:val="0"/>
+          <w:i w:val="0"/>
+          <w:iCs w:val="0"/>
+          <w:smallCaps w:val="0"/>
+          <w:strike w:val="0"/>
+          <w:color w:val="000000"/>
+          <w:sz w:val="22"/>
+          <w:szCs w:val="22"/>
+          <w:u w:val="none"/>
+          <w:shd w:fill="auto" w:val="clear"/>
+          <w:vertAlign w:val="baseline"/>
+          <w:rtl w:val="0"/>
+        </w:rPr>
+        <w:t xml:space="preserve">Al terminar la animación se muestra "¡Listo!" o, si era la última vida, la pantalla de Game Over.</w:t>
+      </w:r>
+    </w:p>
+    <w:p>
+      <w:pPr>
+        <w:keepNext w:val="0"/>
+        <w:keepLines w:val="0"/>
+        <w:pageBreakBefore w:val="0"/>
+        <w:widowControl w:val="1"/>
+        <w:numPr>
+          <w:ilvl w:val="0"/>
+          <w:numId w:val="38"/>
+        </w:numPr>
+        <w:pBdr>
+          <w:top w:space="0" w:sz="0" w:val="nil"/>
+          <w:left w:space="0" w:sz="0" w:val="nil"/>
+          <w:bottom w:space="0" w:sz="0" w:val="nil"/>
+          <w:right w:space="0" w:sz="0" w:val="nil"/>
+          <w:between w:space="0" w:sz="0" w:val="nil"/>
+        </w:pBdr>
+        <w:shd w:fill="auto" w:val="clear"/>
+        <w:spacing w:after="0" w:before="0" w:line="259" w:lineRule="auto"/>
+        <w:ind w:left="720" w:right="0" w:hanging="360"/>
+        <w:jc w:val="left"/>
+        <w:rPr/>
+      </w:pPr>
+      <w:r>
+        <w:rPr>
+          <w:rFonts w:ascii="Calibri" w:cs="Calibri" w:eastAsia="Calibri" w:hAnsi="Calibri"/>
+          <w:b w:val="0"/>
+          <w:bCs w:val="0"/>
+          <w:i w:val="0"/>
+          <w:iCs w:val="0"/>
+          <w:smallCaps w:val="0"/>
+          <w:strike w:val="0"/>
+          <w:color w:val="000000"/>
+          <w:sz w:val="22"/>
+          <w:szCs w:val="22"/>
+          <w:u w:val="none"/>
+          <w:shd w:fill="auto" w:val="clear"/>
+          <w:vertAlign w:val="baseline"/>
+          <w:rtl w:val="0"/>
+        </w:rPr>
+        <w:t xml:space="preserve">La animación se usa en los dos modos, también cuando el jugador de fantasma derrota a Pacman.</w:t>
+      </w:r>
+    </w:p>
+    <w:p>
+      <w:pPr>
+        <w:keepNext w:val="0"/>
+        <w:keepLines w:val="0"/>
+        <w:pageBreakBefore w:val="0"/>
+        <w:widowControl w:val="1"/>
+        <w:numPr>
+          <w:ilvl w:val="0"/>
+          <w:numId w:val="38"/>
+        </w:numPr>
+        <w:pBdr>
+          <w:top w:space="0" w:sz="0" w:val="nil"/>
+          <w:left w:space="0" w:sz="0" w:val="nil"/>
+          <w:bottom w:space="0" w:sz="0" w:val="nil"/>
+          <w:right w:space="0" w:sz="0" w:val="nil"/>
+          <w:between w:space="0" w:sz="0" w:val="nil"/>
+        </w:pBdr>
+        <w:shd w:fill="auto" w:val="clear"/>
+        <w:spacing w:after="0" w:before="0" w:line="259" w:lineRule="auto"/>
+        <w:ind w:left="720" w:right="0" w:hanging="360"/>
+        <w:jc w:val="left"/>
+        <w:rPr/>
+      </w:pPr>
+      <w:r>
+        <w:rPr>
+          <w:rFonts w:ascii="Calibri" w:cs="Calibri" w:eastAsia="Calibri" w:hAnsi="Calibri"/>
+          <w:b w:val="0"/>
+          <w:bCs w:val="0"/>
+          <w:i w:val="0"/>
+          <w:iCs w:val="0"/>
+          <w:smallCaps w:val="0"/>
+          <w:strike w:val="0"/>
+          <w:color w:val="000000"/>
+          <w:sz w:val="22"/>
+          <w:szCs w:val="22"/>
+          <w:u w:val="none"/>
+          <w:shd w:fill="auto" w:val="clear"/>
+          <w:vertAlign w:val="baseline"/>
+          <w:rtl w:val="0"/>
+        </w:rPr>
+        <w:t xml:space="preserve">Durante la animación no se suman puntos ni avanza ningún temporizador.</w:t>
+      </w:r>
+    </w:p>
+    <w:p>
+      <w:pPr>
+        <w:pStyle w:val="Heading4"/>
+        <w:rPr/>
+      </w:pPr>
+      <w:r>
+        <w:rPr>
+          <w:rtl w:val="0"/>
+        </w:rPr>
+        <w:t xml:space="preserve">HU-48 · Escuchar la música y los sonidos del juego</w:t>
+      </w:r>
+    </w:p>
+    <w:p>
+      <w:pPr>
+        <w:rPr/>
+      </w:pPr>
+      <w:r>
+        <w:rPr>
+          <w:i w:val="1"/>
+          <w:iCs w:val="1"/>
+          <w:rtl w:val="0"/>
+        </w:rPr>
+        <w:t xml:space="preserve">Épica: E12 · Versión: V3 · Prioridad: Baja</w:t>
+      </w:r>
+      <w:r>
+        <w:rPr>
+          <w:rtl w:val="0"/>
+        </w:rPr>
+      </w:r>
+    </w:p>
+    <w:p>
+      <w:pPr>
+        <w:rPr/>
+      </w:pPr>
+      <w:r>
+        <w:rPr>
+          <w:b w:val="1"/>
+          <w:bCs w:val="1"/>
+          <w:rtl w:val="0"/>
+        </w:rPr>
+        <w:t xml:space="preserve">Como</w:t>
+      </w:r>
+      <w:r>
+        <w:rPr>
+          <w:rtl w:val="0"/>
+        </w:rPr>
+        <w:t xml:space="preserve"> jugador </w:t>
+      </w:r>
+      <w:r>
+        <w:rPr>
+          <w:b w:val="1"/>
+          <w:bCs w:val="1"/>
+          <w:rtl w:val="0"/>
+        </w:rPr>
+        <w:t xml:space="preserve">quiero</w:t>
+      </w:r>
+      <w:r>
+        <w:rPr>
+          <w:rtl w:val="0"/>
+        </w:rPr>
+        <w:t xml:space="preserve"> escuchar música y efectos de sonido durante la partida </w:t>
+      </w:r>
+      <w:r>
+        <w:rPr>
+          <w:b w:val="1"/>
+          <w:bCs w:val="1"/>
+          <w:rtl w:val="0"/>
+        </w:rPr>
+        <w:t xml:space="preserve">para</w:t>
+      </w:r>
+      <w:r>
+        <w:rPr>
+          <w:rtl w:val="0"/>
+        </w:rPr>
+        <w:t xml:space="preserve"> sentir el ritmo del juego y recibir señales de lo que pasa sin tener que mirar todo.</w:t>
+      </w:r>
+    </w:p>
+    <w:p>
+      <w:pPr>
+        <w:rPr/>
+      </w:pPr>
+      <w:r>
+        <w:rPr>
+          <w:b w:val="1"/>
+          <w:bCs w:val="1"/>
+          <w:rtl w:val="0"/>
+        </w:rPr>
+        <w:t xml:space="preserve">Criterios de aceptación:</w:t>
+      </w:r>
+      <w:r>
+        <w:rPr>
+          <w:rtl w:val="0"/>
+        </w:rPr>
+      </w:r>
+    </w:p>
+    <w:p>
+      <w:pPr>
+        <w:keepNext w:val="0"/>
+        <w:keepLines w:val="0"/>
+        <w:pageBreakBefore w:val="0"/>
+        <w:widowControl w:val="1"/>
+        <w:numPr>
+          <w:ilvl w:val="0"/>
+          <w:numId w:val="38"/>
+        </w:numPr>
+        <w:pBdr>
+          <w:top w:space="0" w:sz="0" w:val="nil"/>
+          <w:left w:space="0" w:sz="0" w:val="nil"/>
+          <w:bottom w:space="0" w:sz="0" w:val="nil"/>
+          <w:right w:space="0" w:sz="0" w:val="nil"/>
+          <w:between w:space="0" w:sz="0" w:val="nil"/>
+        </w:pBdr>
+        <w:shd w:fill="auto" w:val="clear"/>
+        <w:spacing w:after="0" w:before="0" w:line="259" w:lineRule="auto"/>
+        <w:ind w:left="720" w:right="0" w:hanging="360"/>
+        <w:jc w:val="left"/>
+        <w:rPr/>
+      </w:pPr>
+      <w:r>
+        <w:rPr>
+          <w:rFonts w:ascii="Calibri" w:cs="Calibri" w:eastAsia="Calibri" w:hAnsi="Calibri"/>
+          <w:b w:val="0"/>
+          <w:bCs w:val="0"/>
+          <w:i w:val="0"/>
+          <w:iCs w:val="0"/>
+          <w:smallCaps w:val="0"/>
+          <w:strike w:val="0"/>
+          <w:color w:val="000000"/>
+          <w:sz w:val="22"/>
+          <w:szCs w:val="22"/>
+          <w:u w:val="none"/>
+          <w:shd w:fill="auto" w:val="clear"/>
+          <w:vertAlign w:val="baseline"/>
+          <w:rtl w:val="0"/>
+        </w:rPr>
+        <w:t xml:space="preserve">Suena un jingle al iniciar la partida y una sirena de fondo durante el nivel.</w:t>
+      </w:r>
+    </w:p>
+    <w:p>
+      <w:pPr>
+        <w:keepNext w:val="0"/>
+        <w:keepLines w:val="0"/>
+        <w:pageBreakBefore w:val="0"/>
+        <w:widowControl w:val="1"/>
+        <w:numPr>
+          <w:ilvl w:val="0"/>
+          <w:numId w:val="38"/>
+        </w:numPr>
+        <w:pBdr>
+          <w:top w:space="0" w:sz="0" w:val="nil"/>
+          <w:left w:space="0" w:sz="0" w:val="nil"/>
+          <w:bottom w:space="0" w:sz="0" w:val="nil"/>
+          <w:right w:space="0" w:sz="0" w:val="nil"/>
+          <w:between w:space="0" w:sz="0" w:val="nil"/>
+        </w:pBdr>
+        <w:shd w:fill="auto" w:val="clear"/>
+        <w:spacing w:after="0" w:before="0" w:line="259" w:lineRule="auto"/>
+        <w:ind w:left="720" w:right="0" w:hanging="360"/>
+        <w:jc w:val="left"/>
+        <w:rPr/>
+      </w:pPr>
+      <w:r>
+        <w:rPr>
+          <w:rFonts w:ascii="Calibri" w:cs="Calibri" w:eastAsia="Calibri" w:hAnsi="Calibri"/>
+          <w:b w:val="0"/>
+          <w:bCs w:val="0"/>
+          <w:i w:val="0"/>
+          <w:iCs w:val="0"/>
+          <w:smallCaps w:val="0"/>
+          <w:strike w:val="0"/>
+          <w:color w:val="000000"/>
+          <w:sz w:val="22"/>
+          <w:szCs w:val="22"/>
+          <w:u w:val="none"/>
+          <w:shd w:fill="auto" w:val="clear"/>
+          <w:vertAlign w:val="baseline"/>
+          <w:rtl w:val="0"/>
+        </w:rPr>
+        <w:t xml:space="preserve">Durante el PowerUp la sirena de fondo cambia por la del PowerUp.</w:t>
+      </w:r>
+    </w:p>
+    <w:p>
+      <w:pPr>
+        <w:keepNext w:val="0"/>
+        <w:keepLines w:val="0"/>
+        <w:pageBreakBefore w:val="0"/>
+        <w:widowControl w:val="1"/>
+        <w:numPr>
+          <w:ilvl w:val="0"/>
+          <w:numId w:val="38"/>
+        </w:numPr>
+        <w:pBdr>
+          <w:top w:space="0" w:sz="0" w:val="nil"/>
+          <w:left w:space="0" w:sz="0" w:val="nil"/>
+          <w:bottom w:space="0" w:sz="0" w:val="nil"/>
+          <w:right w:space="0" w:sz="0" w:val="nil"/>
+          <w:between w:space="0" w:sz="0" w:val="nil"/>
+        </w:pBdr>
+        <w:shd w:fill="auto" w:val="clear"/>
+        <w:spacing w:after="0" w:before="0" w:line="259" w:lineRule="auto"/>
+        <w:ind w:left="720" w:right="0" w:hanging="360"/>
+        <w:jc w:val="left"/>
+        <w:rPr/>
+      </w:pPr>
+      <w:r>
+        <w:rPr>
+          <w:rFonts w:ascii="Calibri" w:cs="Calibri" w:eastAsia="Calibri" w:hAnsi="Calibri"/>
+          <w:b w:val="0"/>
+          <w:bCs w:val="0"/>
+          <w:i w:val="0"/>
+          <w:iCs w:val="0"/>
+          <w:smallCaps w:val="0"/>
+          <w:strike w:val="0"/>
+          <w:color w:val="000000"/>
+          <w:sz w:val="22"/>
+          <w:szCs w:val="22"/>
+          <w:u w:val="none"/>
+          <w:shd w:fill="auto" w:val="clear"/>
+          <w:vertAlign w:val="baseline"/>
+          <w:rtl w:val="0"/>
+        </w:rPr>
+        <w:t xml:space="preserve">Comer esferas produce el sonido "waka" característico.</w:t>
+      </w:r>
+    </w:p>
+    <w:p>
+      <w:pPr>
+        <w:keepNext w:val="0"/>
+        <w:keepLines w:val="0"/>
+        <w:pageBreakBefore w:val="0"/>
+        <w:widowControl w:val="1"/>
+        <w:numPr>
+          <w:ilvl w:val="0"/>
+          <w:numId w:val="38"/>
+        </w:numPr>
+        <w:pBdr>
+          <w:top w:space="0" w:sz="0" w:val="nil"/>
+          <w:left w:space="0" w:sz="0" w:val="nil"/>
+          <w:bottom w:space="0" w:sz="0" w:val="nil"/>
+          <w:right w:space="0" w:sz="0" w:val="nil"/>
+          <w:between w:space="0" w:sz="0" w:val="nil"/>
+        </w:pBdr>
+        <w:shd w:fill="auto" w:val="clear"/>
+        <w:spacing w:after="0" w:before="0" w:line="259" w:lineRule="auto"/>
+        <w:ind w:left="720" w:right="0" w:hanging="360"/>
+        <w:jc w:val="left"/>
+        <w:rPr/>
+      </w:pPr>
+      <w:r>
+        <w:rPr>
+          <w:rFonts w:ascii="Calibri" w:cs="Calibri" w:eastAsia="Calibri" w:hAnsi="Calibri"/>
+          <w:b w:val="0"/>
+          <w:bCs w:val="0"/>
+          <w:i w:val="0"/>
+          <w:iCs w:val="0"/>
+          <w:smallCaps w:val="0"/>
+          <w:strike w:val="0"/>
+          <w:color w:val="000000"/>
+          <w:sz w:val="22"/>
+          <w:szCs w:val="22"/>
+          <w:u w:val="none"/>
+          <w:shd w:fill="auto" w:val="clear"/>
+          <w:vertAlign w:val="baseline"/>
+          <w:rtl w:val="0"/>
+        </w:rPr>
+        <w:t xml:space="preserve">Cada evento de la lista de la sección 4.7 tiene su sonido: esfera grande, comer un fantasma, ojos que vuelven, fruta, derrota de Pacman, cuenta regresiva, cada poder y romper un muro.</w:t>
+      </w:r>
+    </w:p>
+    <w:p>
+      <w:pPr>
+        <w:keepNext w:val="0"/>
+        <w:keepLines w:val="0"/>
+        <w:pageBreakBefore w:val="0"/>
+        <w:widowControl w:val="1"/>
+        <w:numPr>
+          <w:ilvl w:val="0"/>
+          <w:numId w:val="38"/>
+        </w:numPr>
+        <w:pBdr>
+          <w:top w:space="0" w:sz="0" w:val="nil"/>
+          <w:left w:space="0" w:sz="0" w:val="nil"/>
+          <w:bottom w:space="0" w:sz="0" w:val="nil"/>
+          <w:right w:space="0" w:sz="0" w:val="nil"/>
+          <w:between w:space="0" w:sz="0" w:val="nil"/>
+        </w:pBdr>
+        <w:shd w:fill="auto" w:val="clear"/>
+        <w:spacing w:after="0" w:before="0" w:line="259" w:lineRule="auto"/>
+        <w:ind w:left="720" w:right="0" w:hanging="360"/>
+        <w:jc w:val="left"/>
+        <w:rPr/>
+      </w:pPr>
+      <w:r>
+        <w:rPr>
+          <w:rFonts w:ascii="Calibri" w:cs="Calibri" w:eastAsia="Calibri" w:hAnsi="Calibri"/>
+          <w:b w:val="0"/>
+          <w:bCs w:val="0"/>
+          <w:i w:val="0"/>
+          <w:iCs w:val="0"/>
+          <w:smallCaps w:val="0"/>
+          <w:strike w:val="0"/>
+          <w:color w:val="000000"/>
+          <w:sz w:val="22"/>
+          <w:szCs w:val="22"/>
+          <w:u w:val="none"/>
+          <w:shd w:fill="auto" w:val="clear"/>
+          <w:vertAlign w:val="baseline"/>
+          <w:rtl w:val="0"/>
+        </w:rPr>
+        <w:t xml:space="preserve">Cada sonido pertenece al canal de música o al de efectos, según la sección 4.7.</w:t>
+      </w:r>
+    </w:p>
+    <w:p>
+      <w:pPr>
+        <w:keepNext w:val="0"/>
+        <w:keepLines w:val="0"/>
+        <w:pageBreakBefore w:val="0"/>
+        <w:widowControl w:val="1"/>
+        <w:numPr>
+          <w:ilvl w:val="0"/>
+          <w:numId w:val="38"/>
+        </w:numPr>
+        <w:pBdr>
+          <w:top w:space="0" w:sz="0" w:val="nil"/>
+          <w:left w:space="0" w:sz="0" w:val="nil"/>
+          <w:bottom w:space="0" w:sz="0" w:val="nil"/>
+          <w:right w:space="0" w:sz="0" w:val="nil"/>
+          <w:between w:space="0" w:sz="0" w:val="nil"/>
+        </w:pBdr>
+        <w:shd w:fill="auto" w:val="clear"/>
+        <w:spacing w:after="0" w:before="0" w:line="259" w:lineRule="auto"/>
+        <w:ind w:left="720" w:right="0" w:hanging="360"/>
+        <w:jc w:val="left"/>
+        <w:rPr/>
+      </w:pPr>
+      <w:r>
+        <w:rPr>
+          <w:rFonts w:ascii="Calibri" w:cs="Calibri" w:eastAsia="Calibri" w:hAnsi="Calibri"/>
+          <w:b w:val="0"/>
+          <w:bCs w:val="0"/>
+          <w:i w:val="0"/>
+          <w:iCs w:val="0"/>
+          <w:smallCaps w:val="0"/>
+          <w:strike w:val="0"/>
+          <w:color w:val="000000"/>
+          <w:sz w:val="22"/>
+          <w:szCs w:val="22"/>
+          <w:u w:val="none"/>
+          <w:shd w:fill="auto" w:val="clear"/>
+          <w:vertAlign w:val="baseline"/>
+          <w:rtl w:val="0"/>
+        </w:rPr>
+        <w:t xml:space="preserve">Nada suena con la partida en pausa ni con la pestaña del navegador oculta.</w:t>
+      </w:r>
+    </w:p>
+    <w:p>
+      <w:pPr>
+        <w:keepNext w:val="0"/>
+        <w:keepLines w:val="0"/>
+        <w:pageBreakBefore w:val="0"/>
+        <w:widowControl w:val="1"/>
+        <w:numPr>
+          <w:ilvl w:val="0"/>
+          <w:numId w:val="38"/>
+        </w:numPr>
+        <w:pBdr>
+          <w:top w:space="0" w:sz="0" w:val="nil"/>
+          <w:left w:space="0" w:sz="0" w:val="nil"/>
+          <w:bottom w:space="0" w:sz="0" w:val="nil"/>
+          <w:right w:space="0" w:sz="0" w:val="nil"/>
+          <w:between w:space="0" w:sz="0" w:val="nil"/>
+        </w:pBdr>
+        <w:shd w:fill="auto" w:val="clear"/>
+        <w:spacing w:after="0" w:before="0" w:line="259" w:lineRule="auto"/>
+        <w:ind w:left="720" w:right="0" w:hanging="360"/>
+        <w:jc w:val="left"/>
+        <w:rPr/>
+      </w:pPr>
+      <w:r>
+        <w:rPr>
+          <w:rFonts w:ascii="Calibri" w:cs="Calibri" w:eastAsia="Calibri" w:hAnsi="Calibri"/>
+          <w:b w:val="0"/>
+          <w:bCs w:val="0"/>
+          <w:i w:val="0"/>
+          <w:iCs w:val="0"/>
+          <w:smallCaps w:val="0"/>
+          <w:strike w:val="0"/>
+          <w:color w:val="000000"/>
+          <w:sz w:val="22"/>
+          <w:szCs w:val="22"/>
+          <w:u w:val="none"/>
+          <w:shd w:fill="auto" w:val="clear"/>
+          <w:vertAlign w:val="baseline"/>
+          <w:rtl w:val="0"/>
+        </w:rPr>
+        <w:t xml:space="preserve">La música y los efectos son originales.</w:t>
+      </w:r>
+    </w:p>
+    <w:p>
+      <w:pPr>
+        <w:pStyle w:val="Heading4"/>
+        <w:rPr/>
+      </w:pPr>
+      <w:r>
+        <w:rPr>
+          <w:rtl w:val="0"/>
+        </w:rPr>
+        <w:t xml:space="preserve">HU-49 · Ver los poderes de los fantasmas en acción</w:t>
+      </w:r>
+    </w:p>
+    <w:p>
+      <w:pPr>
+        <w:rPr/>
+      </w:pPr>
+      <w:r>
+        <w:rPr>
+          <w:i w:val="1"/>
+          <w:iCs w:val="1"/>
+          <w:rtl w:val="0"/>
+        </w:rPr>
+        <w:t xml:space="preserve">Épica: E12 · Versión: V3 · Prioridad: Baja</w:t>
+      </w:r>
+      <w:r>
+        <w:rPr>
+          <w:rtl w:val="0"/>
+        </w:rPr>
+      </w:r>
+    </w:p>
+    <w:p>
+      <w:pPr>
+        <w:rPr/>
+      </w:pPr>
+      <w:r>
+        <w:rPr>
+          <w:b w:val="1"/>
+          <w:bCs w:val="1"/>
+          <w:rtl w:val="0"/>
+        </w:rPr>
+        <w:t xml:space="preserve">Como</w:t>
+      </w:r>
+      <w:r>
+        <w:rPr>
+          <w:rtl w:val="0"/>
+        </w:rPr>
+        <w:t xml:space="preserve"> jugador </w:t>
+      </w:r>
+      <w:r>
+        <w:rPr>
+          <w:b w:val="1"/>
+          <w:bCs w:val="1"/>
+          <w:rtl w:val="0"/>
+        </w:rPr>
+        <w:t xml:space="preserve">quiero</w:t>
+      </w:r>
+      <w:r>
+        <w:rPr>
+          <w:rtl w:val="0"/>
+        </w:rPr>
+        <w:t xml:space="preserve"> que cada poder tenga su animación y su sonido </w:t>
+      </w:r>
+      <w:r>
+        <w:rPr>
+          <w:b w:val="1"/>
+          <w:bCs w:val="1"/>
+          <w:rtl w:val="0"/>
+        </w:rPr>
+        <w:t xml:space="preserve">para</w:t>
+      </w:r>
+      <w:r>
+        <w:rPr>
+          <w:rtl w:val="0"/>
+        </w:rPr>
+        <w:t xml:space="preserve"> entender qué hizo un fantasma en el momento en que lo usa.</w:t>
+      </w:r>
+    </w:p>
+    <w:p>
+      <w:pPr>
+        <w:rPr/>
+      </w:pPr>
+      <w:r>
+        <w:rPr>
+          <w:b w:val="1"/>
+          <w:bCs w:val="1"/>
+          <w:rtl w:val="0"/>
+        </w:rPr>
+        <w:t xml:space="preserve">Criterios de aceptación:</w:t>
+      </w:r>
+      <w:r>
+        <w:rPr>
+          <w:rtl w:val="0"/>
+        </w:rPr>
+      </w:r>
+    </w:p>
+    <w:p>
+      <w:pPr>
+        <w:keepNext w:val="0"/>
+        <w:keepLines w:val="0"/>
+        <w:pageBreakBefore w:val="0"/>
+        <w:widowControl w:val="1"/>
+        <w:numPr>
+          <w:ilvl w:val="0"/>
+          <w:numId w:val="38"/>
+        </w:numPr>
+        <w:pBdr>
+          <w:top w:space="0" w:sz="0" w:val="nil"/>
+          <w:left w:space="0" w:sz="0" w:val="nil"/>
+          <w:bottom w:space="0" w:sz="0" w:val="nil"/>
+          <w:right w:space="0" w:sz="0" w:val="nil"/>
+          <w:between w:space="0" w:sz="0" w:val="nil"/>
+        </w:pBdr>
+        <w:shd w:fill="auto" w:val="clear"/>
+        <w:spacing w:after="0" w:before="0" w:line="259" w:lineRule="auto"/>
+        <w:ind w:left="720" w:right="0" w:hanging="360"/>
+        <w:jc w:val="left"/>
+        <w:rPr/>
+      </w:pPr>
+      <w:r>
+        <w:rPr>
+          <w:rFonts w:ascii="Calibri" w:cs="Calibri" w:eastAsia="Calibri" w:hAnsi="Calibri"/>
+          <w:b w:val="0"/>
+          <w:bCs w:val="0"/>
+          <w:i w:val="0"/>
+          <w:iCs w:val="0"/>
+          <w:smallCaps w:val="0"/>
+          <w:strike w:val="0"/>
+          <w:color w:val="000000"/>
+          <w:sz w:val="22"/>
+          <w:szCs w:val="22"/>
+          <w:u w:val="none"/>
+          <w:shd w:fill="auto" w:val="clear"/>
+          <w:vertAlign w:val="baseline"/>
+          <w:rtl w:val="0"/>
+        </w:rPr>
+        <w:t xml:space="preserve">El acelerado se impulsa recorriendo las celdas, con una estela que se desvanece, en lugar de aparecer de golpe en el destino.</w:t>
+      </w:r>
+    </w:p>
+    <w:p>
+      <w:pPr>
+        <w:keepNext w:val="0"/>
+        <w:keepLines w:val="0"/>
+        <w:pageBreakBefore w:val="0"/>
+        <w:widowControl w:val="1"/>
+        <w:numPr>
+          <w:ilvl w:val="0"/>
+          <w:numId w:val="38"/>
+        </w:numPr>
+        <w:pBdr>
+          <w:top w:space="0" w:sz="0" w:val="nil"/>
+          <w:left w:space="0" w:sz="0" w:val="nil"/>
+          <w:bottom w:space="0" w:sz="0" w:val="nil"/>
+          <w:right w:space="0" w:sz="0" w:val="nil"/>
+          <w:between w:space="0" w:sz="0" w:val="nil"/>
+        </w:pBdr>
+        <w:shd w:fill="auto" w:val="clear"/>
+        <w:spacing w:after="0" w:before="0" w:line="259" w:lineRule="auto"/>
+        <w:ind w:left="720" w:right="0" w:hanging="360"/>
+        <w:jc w:val="left"/>
+        <w:rPr/>
+      </w:pPr>
+      <w:r>
+        <w:rPr>
+          <w:rFonts w:ascii="Calibri" w:cs="Calibri" w:eastAsia="Calibri" w:hAnsi="Calibri"/>
+          <w:b w:val="0"/>
+          <w:bCs w:val="0"/>
+          <w:i w:val="0"/>
+          <w:iCs w:val="0"/>
+          <w:smallCaps w:val="0"/>
+          <w:strike w:val="0"/>
+          <w:color w:val="000000"/>
+          <w:sz w:val="22"/>
+          <w:szCs w:val="22"/>
+          <w:u w:val="none"/>
+          <w:shd w:fill="auto" w:val="clear"/>
+          <w:vertAlign w:val="baseline"/>
+          <w:rtl w:val="0"/>
+        </w:rPr>
+        <w:t xml:space="preserve">El saltarín salta en arco; la celda de destino se marca con una sombra antes del aterrizaje y levanta polvo al caer.</w:t>
+      </w:r>
+    </w:p>
+    <w:p>
+      <w:pPr>
+        <w:keepNext w:val="0"/>
+        <w:keepLines w:val="0"/>
+        <w:pageBreakBefore w:val="0"/>
+        <w:widowControl w:val="1"/>
+        <w:numPr>
+          <w:ilvl w:val="0"/>
+          <w:numId w:val="38"/>
+        </w:numPr>
+        <w:pBdr>
+          <w:top w:space="0" w:sz="0" w:val="nil"/>
+          <w:left w:space="0" w:sz="0" w:val="nil"/>
+          <w:bottom w:space="0" w:sz="0" w:val="nil"/>
+          <w:right w:space="0" w:sz="0" w:val="nil"/>
+          <w:between w:space="0" w:sz="0" w:val="nil"/>
+        </w:pBdr>
+        <w:shd w:fill="auto" w:val="clear"/>
+        <w:spacing w:after="0" w:before="0" w:line="259" w:lineRule="auto"/>
+        <w:ind w:left="720" w:right="0" w:hanging="360"/>
+        <w:jc w:val="left"/>
+        <w:rPr/>
+      </w:pPr>
+      <w:r>
+        <w:rPr>
+          <w:rFonts w:ascii="Calibri" w:cs="Calibri" w:eastAsia="Calibri" w:hAnsi="Calibri"/>
+          <w:b w:val="0"/>
+          <w:bCs w:val="0"/>
+          <w:i w:val="0"/>
+          <w:iCs w:val="0"/>
+          <w:smallCaps w:val="0"/>
+          <w:strike w:val="0"/>
+          <w:color w:val="000000"/>
+          <w:sz w:val="22"/>
+          <w:szCs w:val="22"/>
+          <w:u w:val="none"/>
+          <w:shd w:fill="auto" w:val="clear"/>
+          <w:vertAlign w:val="baseline"/>
+          <w:rtl w:val="0"/>
+        </w:rPr>
+        <w:t xml:space="preserve">El espectro se ve semitransparente y ondulado mientras atraviesa un muro.</w:t>
+      </w:r>
+    </w:p>
+    <w:p>
+      <w:pPr>
+        <w:keepNext w:val="0"/>
+        <w:keepLines w:val="0"/>
+        <w:pageBreakBefore w:val="0"/>
+        <w:widowControl w:val="1"/>
+        <w:numPr>
+          <w:ilvl w:val="0"/>
+          <w:numId w:val="38"/>
+        </w:numPr>
+        <w:pBdr>
+          <w:top w:space="0" w:sz="0" w:val="nil"/>
+          <w:left w:space="0" w:sz="0" w:val="nil"/>
+          <w:bottom w:space="0" w:sz="0" w:val="nil"/>
+          <w:right w:space="0" w:sz="0" w:val="nil"/>
+          <w:between w:space="0" w:sz="0" w:val="nil"/>
+        </w:pBdr>
+        <w:shd w:fill="auto" w:val="clear"/>
+        <w:spacing w:after="0" w:before="0" w:line="259" w:lineRule="auto"/>
+        <w:ind w:left="720" w:right="0" w:hanging="360"/>
+        <w:jc w:val="left"/>
+        <w:rPr/>
+      </w:pPr>
+      <w:r>
+        <w:rPr>
+          <w:rFonts w:ascii="Calibri" w:cs="Calibri" w:eastAsia="Calibri" w:hAnsi="Calibri"/>
+          <w:b w:val="0"/>
+          <w:bCs w:val="0"/>
+          <w:i w:val="0"/>
+          <w:iCs w:val="0"/>
+          <w:smallCaps w:val="0"/>
+          <w:strike w:val="0"/>
+          <w:color w:val="000000"/>
+          <w:sz w:val="22"/>
+          <w:szCs w:val="22"/>
+          <w:u w:val="none"/>
+          <w:shd w:fill="auto" w:val="clear"/>
+          <w:vertAlign w:val="baseline"/>
+          <w:rtl w:val="0"/>
+        </w:rPr>
+        <w:t xml:space="preserve">El naval muestra una aparición al colocar la fruta falsa, la fruta parpadea en sus últimos 2 segundos y la explosión deja ver su radio.</w:t>
+      </w:r>
+    </w:p>
+    <w:p>
+      <w:pPr>
+        <w:keepNext w:val="0"/>
+        <w:keepLines w:val="0"/>
+        <w:pageBreakBefore w:val="0"/>
+        <w:widowControl w:val="1"/>
+        <w:numPr>
+          <w:ilvl w:val="0"/>
+          <w:numId w:val="38"/>
+        </w:numPr>
+        <w:pBdr>
+          <w:top w:space="0" w:sz="0" w:val="nil"/>
+          <w:left w:space="0" w:sz="0" w:val="nil"/>
+          <w:bottom w:space="0" w:sz="0" w:val="nil"/>
+          <w:right w:space="0" w:sz="0" w:val="nil"/>
+          <w:between w:space="0" w:sz="0" w:val="nil"/>
+        </w:pBdr>
+        <w:shd w:fill="auto" w:val="clear"/>
+        <w:spacing w:after="0" w:before="0" w:line="259" w:lineRule="auto"/>
+        <w:ind w:left="720" w:right="0" w:hanging="360"/>
+        <w:jc w:val="left"/>
+        <w:rPr/>
+      </w:pPr>
+      <w:r>
+        <w:rPr>
+          <w:rFonts w:ascii="Calibri" w:cs="Calibri" w:eastAsia="Calibri" w:hAnsi="Calibri"/>
+          <w:b w:val="0"/>
+          <w:bCs w:val="0"/>
+          <w:i w:val="0"/>
+          <w:iCs w:val="0"/>
+          <w:smallCaps w:val="0"/>
+          <w:strike w:val="0"/>
+          <w:color w:val="000000"/>
+          <w:sz w:val="22"/>
+          <w:szCs w:val="22"/>
+          <w:u w:val="none"/>
+          <w:shd w:fill="auto" w:val="clear"/>
+          <w:vertAlign w:val="baseline"/>
+          <w:rtl w:val="0"/>
+        </w:rPr>
+        <w:t xml:space="preserve">Romper un muro muestra escombros sobre la celda.</w:t>
+      </w:r>
+    </w:p>
+    <w:p>
+      <w:pPr>
+        <w:keepNext w:val="0"/>
+        <w:keepLines w:val="0"/>
+        <w:pageBreakBefore w:val="0"/>
+        <w:widowControl w:val="1"/>
+        <w:numPr>
+          <w:ilvl w:val="0"/>
+          <w:numId w:val="38"/>
+        </w:numPr>
+        <w:pBdr>
+          <w:top w:space="0" w:sz="0" w:val="nil"/>
+          <w:left w:space="0" w:sz="0" w:val="nil"/>
+          <w:bottom w:space="0" w:sz="0" w:val="nil"/>
+          <w:right w:space="0" w:sz="0" w:val="nil"/>
+          <w:between w:space="0" w:sz="0" w:val="nil"/>
+        </w:pBdr>
+        <w:shd w:fill="auto" w:val="clear"/>
+        <w:spacing w:after="0" w:before="0" w:line="259" w:lineRule="auto"/>
+        <w:ind w:left="720" w:right="0" w:hanging="360"/>
+        <w:jc w:val="left"/>
+        <w:rPr/>
+      </w:pPr>
+      <w:r>
+        <w:rPr>
+          <w:rFonts w:ascii="Calibri" w:cs="Calibri" w:eastAsia="Calibri" w:hAnsi="Calibri"/>
+          <w:b w:val="0"/>
+          <w:bCs w:val="0"/>
+          <w:i w:val="0"/>
+          <w:iCs w:val="0"/>
+          <w:smallCaps w:val="0"/>
+          <w:strike w:val="0"/>
+          <w:color w:val="000000"/>
+          <w:sz w:val="22"/>
+          <w:szCs w:val="22"/>
+          <w:u w:val="none"/>
+          <w:shd w:fill="auto" w:val="clear"/>
+          <w:vertAlign w:val="baseline"/>
+          <w:rtl w:val="0"/>
+        </w:rPr>
+        <w:t xml:space="preserve">Cada poder tiene su propio sonido.</w:t>
+      </w:r>
+    </w:p>
+    <w:p>
+      <w:pPr>
+        <w:keepNext w:val="0"/>
+        <w:keepLines w:val="0"/>
+        <w:pageBreakBefore w:val="0"/>
+        <w:widowControl w:val="1"/>
+        <w:numPr>
+          <w:ilvl w:val="0"/>
+          <w:numId w:val="38"/>
+        </w:numPr>
+        <w:pBdr>
+          <w:top w:space="0" w:sz="0" w:val="nil"/>
+          <w:left w:space="0" w:sz="0" w:val="nil"/>
+          <w:bottom w:space="0" w:sz="0" w:val="nil"/>
+          <w:right w:space="0" w:sz="0" w:val="nil"/>
+          <w:between w:space="0" w:sz="0" w:val="nil"/>
+        </w:pBdr>
+        <w:shd w:fill="auto" w:val="clear"/>
+        <w:spacing w:after="0" w:before="0" w:line="259" w:lineRule="auto"/>
+        <w:ind w:left="720" w:right="0" w:hanging="360"/>
+        <w:jc w:val="left"/>
+        <w:rPr/>
+      </w:pPr>
+      <w:r>
+        <w:rPr>
+          <w:rFonts w:ascii="Calibri" w:cs="Calibri" w:eastAsia="Calibri" w:hAnsi="Calibri"/>
+          <w:b w:val="0"/>
+          <w:bCs w:val="0"/>
+          <w:i w:val="0"/>
+          <w:iCs w:val="0"/>
+          <w:smallCaps w:val="0"/>
+          <w:strike w:val="0"/>
+          <w:color w:val="000000"/>
+          <w:sz w:val="22"/>
+          <w:szCs w:val="22"/>
+          <w:u w:val="none"/>
+          <w:shd w:fill="auto" w:val="clear"/>
+          <w:vertAlign w:val="baseline"/>
+          <w:rtl w:val="0"/>
+        </w:rPr>
+        <w:t xml:space="preserve">Las animaciones no cambian las reglas de los poderes: duraciones, colisiones y cooldowns son los de la sección 4.4.</w:t>
+      </w:r>
+    </w:p>
+    <w:p>
+      <w:pPr>
+        <w:pStyle w:val="Heading4"/>
+        <w:rPr/>
+      </w:pPr>
+      <w:r>
+        <w:rPr>
+          <w:rtl w:val="0"/>
+        </w:rPr>
+        <w:t xml:space="preserve">HU-50 · Ver a Pacman y a los fantasmas en pixel art</w:t>
+      </w:r>
+    </w:p>
+    <w:p>
+      <w:pPr>
+        <w:rPr/>
+      </w:pPr>
+      <w:r>
+        <w:rPr>
+          <w:i w:val="1"/>
+          <w:iCs w:val="1"/>
+          <w:rtl w:val="0"/>
+        </w:rPr>
+        <w:t xml:space="preserve">Épica: E12 · Versión: V3 · Prioridad: Media</w:t>
+      </w:r>
+      <w:r>
+        <w:rPr>
+          <w:rtl w:val="0"/>
+        </w:rPr>
+      </w:r>
+    </w:p>
+    <w:p>
+      <w:pPr>
+        <w:rPr/>
+      </w:pPr>
+      <w:r>
+        <w:rPr>
+          <w:b w:val="1"/>
+          <w:bCs w:val="1"/>
+          <w:rtl w:val="0"/>
+        </w:rPr>
+        <w:t xml:space="preserve">Como</w:t>
+      </w:r>
+      <w:r>
+        <w:rPr>
+          <w:rtl w:val="0"/>
+        </w:rPr>
+        <w:t xml:space="preserve"> jugador </w:t>
+      </w:r>
+      <w:r>
+        <w:rPr>
+          <w:b w:val="1"/>
+          <w:bCs w:val="1"/>
+          <w:rtl w:val="0"/>
+        </w:rPr>
+        <w:t xml:space="preserve">quiero</w:t>
+      </w:r>
+      <w:r>
+        <w:rPr>
+          <w:rtl w:val="0"/>
+        </w:rPr>
+        <w:t xml:space="preserve"> que Pacman, los fantasmas y las frutas tengan sprites de pixel art </w:t>
+      </w:r>
+      <w:r>
+        <w:rPr>
+          <w:b w:val="1"/>
+          <w:bCs w:val="1"/>
+          <w:rtl w:val="0"/>
+        </w:rPr>
+        <w:t xml:space="preserve">para</w:t>
+      </w:r>
+      <w:r>
+        <w:rPr>
+          <w:rtl w:val="0"/>
+        </w:rPr>
+        <w:t xml:space="preserve"> que el juego se vea como un arcade clásico.</w:t>
+      </w:r>
+    </w:p>
+    <w:p>
+      <w:pPr>
+        <w:rPr/>
+      </w:pPr>
+      <w:r>
+        <w:rPr>
+          <w:b w:val="1"/>
+          <w:bCs w:val="1"/>
+          <w:rtl w:val="0"/>
+        </w:rPr>
+        <w:t xml:space="preserve">Criterios de aceptación:</w:t>
+      </w:r>
+      <w:r>
+        <w:rPr>
+          <w:rtl w:val="0"/>
+        </w:rPr>
+      </w:r>
+    </w:p>
+    <w:p>
+      <w:pPr>
+        <w:keepNext w:val="0"/>
+        <w:keepLines w:val="0"/>
+        <w:pageBreakBefore w:val="0"/>
+        <w:widowControl w:val="1"/>
+        <w:numPr>
+          <w:ilvl w:val="0"/>
+          <w:numId w:val="38"/>
+        </w:numPr>
+        <w:pBdr>
+          <w:top w:space="0" w:sz="0" w:val="nil"/>
+          <w:left w:space="0" w:sz="0" w:val="nil"/>
+          <w:bottom w:space="0" w:sz="0" w:val="nil"/>
+          <w:right w:space="0" w:sz="0" w:val="nil"/>
+          <w:between w:space="0" w:sz="0" w:val="nil"/>
+        </w:pBdr>
+        <w:shd w:fill="auto" w:val="clear"/>
+        <w:spacing w:after="0" w:before="0" w:line="259" w:lineRule="auto"/>
+        <w:ind w:left="720" w:right="0" w:hanging="360"/>
+        <w:jc w:val="left"/>
+        <w:rPr/>
+      </w:pPr>
+      <w:r>
+        <w:rPr>
+          <w:rFonts w:ascii="Calibri" w:cs="Calibri" w:eastAsia="Calibri" w:hAnsi="Calibri"/>
+          <w:b w:val="0"/>
+          <w:bCs w:val="0"/>
+          <w:i w:val="0"/>
+          <w:iCs w:val="0"/>
+          <w:smallCaps w:val="0"/>
+          <w:strike w:val="0"/>
+          <w:color w:val="000000"/>
+          <w:sz w:val="22"/>
+          <w:szCs w:val="22"/>
+          <w:u w:val="none"/>
+          <w:shd w:fill="auto" w:val="clear"/>
+          <w:vertAlign w:val="baseline"/>
+          <w:rtl w:val="0"/>
+        </w:rPr>
+        <w:t xml:space="preserve">Pacman abre y cierra la boca mientras avanza, en las cuatro direcciones.</w:t>
+      </w:r>
+    </w:p>
+    <w:p>
+      <w:pPr>
+        <w:keepNext w:val="0"/>
+        <w:keepLines w:val="0"/>
+        <w:pageBreakBefore w:val="0"/>
+        <w:widowControl w:val="1"/>
+        <w:numPr>
+          <w:ilvl w:val="0"/>
+          <w:numId w:val="38"/>
+        </w:numPr>
+        <w:pBdr>
+          <w:top w:space="0" w:sz="0" w:val="nil"/>
+          <w:left w:space="0" w:sz="0" w:val="nil"/>
+          <w:bottom w:space="0" w:sz="0" w:val="nil"/>
+          <w:right w:space="0" w:sz="0" w:val="nil"/>
+          <w:between w:space="0" w:sz="0" w:val="nil"/>
+        </w:pBdr>
+        <w:shd w:fill="auto" w:val="clear"/>
+        <w:spacing w:after="0" w:before="0" w:line="259" w:lineRule="auto"/>
+        <w:ind w:left="720" w:right="0" w:hanging="360"/>
+        <w:jc w:val="left"/>
+        <w:rPr/>
+      </w:pPr>
+      <w:r>
+        <w:rPr>
+          <w:rFonts w:ascii="Calibri" w:cs="Calibri" w:eastAsia="Calibri" w:hAnsi="Calibri"/>
+          <w:b w:val="0"/>
+          <w:bCs w:val="0"/>
+          <w:i w:val="0"/>
+          <w:iCs w:val="0"/>
+          <w:smallCaps w:val="0"/>
+          <w:strike w:val="0"/>
+          <w:color w:val="000000"/>
+          <w:sz w:val="22"/>
+          <w:szCs w:val="22"/>
+          <w:u w:val="none"/>
+          <w:shd w:fill="auto" w:val="clear"/>
+          <w:vertAlign w:val="baseline"/>
+          <w:rtl w:val="0"/>
+        </w:rPr>
+        <w:t xml:space="preserve">Los ojos de los fantasmas miran hacia donde avanzan.</w:t>
+      </w:r>
+    </w:p>
+    <w:p>
+      <w:pPr>
+        <w:keepNext w:val="0"/>
+        <w:keepLines w:val="0"/>
+        <w:pageBreakBefore w:val="0"/>
+        <w:widowControl w:val="1"/>
+        <w:numPr>
+          <w:ilvl w:val="0"/>
+          <w:numId w:val="38"/>
+        </w:numPr>
+        <w:pBdr>
+          <w:top w:space="0" w:sz="0" w:val="nil"/>
+          <w:left w:space="0" w:sz="0" w:val="nil"/>
+          <w:bottom w:space="0" w:sz="0" w:val="nil"/>
+          <w:right w:space="0" w:sz="0" w:val="nil"/>
+          <w:between w:space="0" w:sz="0" w:val="nil"/>
+        </w:pBdr>
+        <w:shd w:fill="auto" w:val="clear"/>
+        <w:spacing w:after="0" w:before="0" w:line="259" w:lineRule="auto"/>
+        <w:ind w:left="720" w:right="0" w:hanging="360"/>
+        <w:jc w:val="left"/>
+        <w:rPr/>
+      </w:pPr>
+      <w:r>
+        <w:rPr>
+          <w:rFonts w:ascii="Calibri" w:cs="Calibri" w:eastAsia="Calibri" w:hAnsi="Calibri"/>
+          <w:b w:val="0"/>
+          <w:bCs w:val="0"/>
+          <w:i w:val="0"/>
+          <w:iCs w:val="0"/>
+          <w:smallCaps w:val="0"/>
+          <w:strike w:val="0"/>
+          <w:color w:val="000000"/>
+          <w:sz w:val="22"/>
+          <w:szCs w:val="22"/>
+          <w:u w:val="none"/>
+          <w:shd w:fill="auto" w:val="clear"/>
+          <w:vertAlign w:val="baseline"/>
+          <w:rtl w:val="0"/>
+        </w:rPr>
+        <w:t xml:space="preserve">Cada tipo de fantasma se distingue de los demás por un rasgo de forma, además del color.</w:t>
+      </w:r>
+    </w:p>
+    <w:p>
+      <w:pPr>
+        <w:keepNext w:val="0"/>
+        <w:keepLines w:val="0"/>
+        <w:pageBreakBefore w:val="0"/>
+        <w:widowControl w:val="1"/>
+        <w:numPr>
+          <w:ilvl w:val="0"/>
+          <w:numId w:val="38"/>
+        </w:numPr>
+        <w:pBdr>
+          <w:top w:space="0" w:sz="0" w:val="nil"/>
+          <w:left w:space="0" w:sz="0" w:val="nil"/>
+          <w:bottom w:space="0" w:sz="0" w:val="nil"/>
+          <w:right w:space="0" w:sz="0" w:val="nil"/>
+          <w:between w:space="0" w:sz="0" w:val="nil"/>
+        </w:pBdr>
+        <w:shd w:fill="auto" w:val="clear"/>
+        <w:spacing w:after="0" w:before="0" w:line="259" w:lineRule="auto"/>
+        <w:ind w:left="720" w:right="0" w:hanging="360"/>
+        <w:jc w:val="left"/>
+        <w:rPr/>
+      </w:pPr>
+      <w:r>
+        <w:rPr>
+          <w:rFonts w:ascii="Calibri" w:cs="Calibri" w:eastAsia="Calibri" w:hAnsi="Calibri"/>
+          <w:b w:val="0"/>
+          <w:bCs w:val="0"/>
+          <w:i w:val="0"/>
+          <w:iCs w:val="0"/>
+          <w:smallCaps w:val="0"/>
+          <w:strike w:val="0"/>
+          <w:color w:val="000000"/>
+          <w:sz w:val="22"/>
+          <w:szCs w:val="22"/>
+          <w:u w:val="none"/>
+          <w:shd w:fill="auto" w:val="clear"/>
+          <w:vertAlign w:val="baseline"/>
+          <w:rtl w:val="0"/>
+        </w:rPr>
+        <w:t xml:space="preserve">El estado vulnerable se ve igual con cualquier skin, y parpadea en los últimos 2 segundos del PowerUp.</w:t>
+      </w:r>
+    </w:p>
+    <w:p>
+      <w:pPr>
+        <w:keepNext w:val="0"/>
+        <w:keepLines w:val="0"/>
+        <w:pageBreakBefore w:val="0"/>
+        <w:widowControl w:val="1"/>
+        <w:numPr>
+          <w:ilvl w:val="0"/>
+          <w:numId w:val="38"/>
+        </w:numPr>
+        <w:pBdr>
+          <w:top w:space="0" w:sz="0" w:val="nil"/>
+          <w:left w:space="0" w:sz="0" w:val="nil"/>
+          <w:bottom w:space="0" w:sz="0" w:val="nil"/>
+          <w:right w:space="0" w:sz="0" w:val="nil"/>
+          <w:between w:space="0" w:sz="0" w:val="nil"/>
+        </w:pBdr>
+        <w:shd w:fill="auto" w:val="clear"/>
+        <w:spacing w:after="0" w:before="0" w:line="259" w:lineRule="auto"/>
+        <w:ind w:left="720" w:right="0" w:hanging="360"/>
+        <w:jc w:val="left"/>
+        <w:rPr/>
+      </w:pPr>
+      <w:r>
+        <w:rPr>
+          <w:rFonts w:ascii="Calibri" w:cs="Calibri" w:eastAsia="Calibri" w:hAnsi="Calibri"/>
+          <w:b w:val="0"/>
+          <w:bCs w:val="0"/>
+          <w:i w:val="0"/>
+          <w:iCs w:val="0"/>
+          <w:smallCaps w:val="0"/>
+          <w:strike w:val="0"/>
+          <w:color w:val="000000"/>
+          <w:sz w:val="22"/>
+          <w:szCs w:val="22"/>
+          <w:u w:val="none"/>
+          <w:shd w:fill="auto" w:val="clear"/>
+          <w:vertAlign w:val="baseline"/>
+          <w:rtl w:val="0"/>
+        </w:rPr>
+        <w:t xml:space="preserve">Los ojos de un fantasma comido se distinguen de un fantasma vivo.</w:t>
+      </w:r>
+    </w:p>
+    <w:p>
+      <w:pPr>
+        <w:keepNext w:val="0"/>
+        <w:keepLines w:val="0"/>
+        <w:pageBreakBefore w:val="0"/>
+        <w:widowControl w:val="1"/>
+        <w:numPr>
+          <w:ilvl w:val="0"/>
+          <w:numId w:val="38"/>
+        </w:numPr>
+        <w:pBdr>
+          <w:top w:space="0" w:sz="0" w:val="nil"/>
+          <w:left w:space="0" w:sz="0" w:val="nil"/>
+          <w:bottom w:space="0" w:sz="0" w:val="nil"/>
+          <w:right w:space="0" w:sz="0" w:val="nil"/>
+          <w:between w:space="0" w:sz="0" w:val="nil"/>
+        </w:pBdr>
+        <w:shd w:fill="auto" w:val="clear"/>
+        <w:spacing w:after="0" w:before="0" w:line="259" w:lineRule="auto"/>
+        <w:ind w:left="720" w:right="0" w:hanging="360"/>
+        <w:jc w:val="left"/>
+        <w:rPr/>
+      </w:pPr>
+      <w:r>
+        <w:rPr>
+          <w:rFonts w:ascii="Calibri" w:cs="Calibri" w:eastAsia="Calibri" w:hAnsi="Calibri"/>
+          <w:b w:val="0"/>
+          <w:bCs w:val="0"/>
+          <w:i w:val="0"/>
+          <w:iCs w:val="0"/>
+          <w:smallCaps w:val="0"/>
+          <w:strike w:val="0"/>
+          <w:color w:val="000000"/>
+          <w:sz w:val="22"/>
+          <w:szCs w:val="22"/>
+          <w:u w:val="none"/>
+          <w:shd w:fill="auto" w:val="clear"/>
+          <w:vertAlign w:val="baseline"/>
+          <w:rtl w:val="0"/>
+        </w:rPr>
+        <w:t xml:space="preserve">La fruta falsa se distingue de la real.</w:t>
+      </w:r>
+    </w:p>
+    <w:p>
+      <w:pPr>
+        <w:keepNext w:val="0"/>
+        <w:keepLines w:val="0"/>
+        <w:pageBreakBefore w:val="0"/>
+        <w:widowControl w:val="1"/>
+        <w:numPr>
+          <w:ilvl w:val="0"/>
+          <w:numId w:val="38"/>
+        </w:numPr>
+        <w:pBdr>
+          <w:top w:space="0" w:sz="0" w:val="nil"/>
+          <w:left w:space="0" w:sz="0" w:val="nil"/>
+          <w:bottom w:space="0" w:sz="0" w:val="nil"/>
+          <w:right w:space="0" w:sz="0" w:val="nil"/>
+          <w:between w:space="0" w:sz="0" w:val="nil"/>
+        </w:pBdr>
+        <w:shd w:fill="auto" w:val="clear"/>
+        <w:spacing w:after="0" w:before="0" w:line="259" w:lineRule="auto"/>
+        <w:ind w:left="720" w:right="0" w:hanging="360"/>
+        <w:jc w:val="left"/>
+        <w:rPr/>
+      </w:pPr>
+      <w:r>
+        <w:rPr>
+          <w:rFonts w:ascii="Calibri" w:cs="Calibri" w:eastAsia="Calibri" w:hAnsi="Calibri"/>
+          <w:b w:val="0"/>
+          <w:bCs w:val="0"/>
+          <w:i w:val="0"/>
+          <w:iCs w:val="0"/>
+          <w:smallCaps w:val="0"/>
+          <w:strike w:val="0"/>
+          <w:color w:val="000000"/>
+          <w:sz w:val="22"/>
+          <w:szCs w:val="22"/>
+          <w:u w:val="none"/>
+          <w:shd w:fill="auto" w:val="clear"/>
+          <w:vertAlign w:val="baseline"/>
+          <w:rtl w:val="0"/>
+        </w:rPr>
+        <w:t xml:space="preserve">Los sprites se dibujan sin difuminar, escalados por un número entero.</w:t>
+      </w:r>
+    </w:p>
+    <w:p>
+      <w:pPr>
         <w:pStyle w:val="Heading2"/>
         <w:rPr/>
       </w:pPr>
@@ -17186,7 +20247,7 @@
         <w:rPr>
           <w:rtl w:val="0"/>
         </w:rPr>
-        <w:t>De las 43 historias, 27 son de prioridad Alta; la V2 concentra la mayor proporción (12 de 14).</w:t>
+        <w:t xml:space="preserve">De las 50 historias, 29 son de prioridad Alta; la V2 concentra la mayor proporción (12 de 14).</w:t>
       </w:r>
     </w:p>
     <w:tbl>
@@ -17535,7 +20596,7 @@
               <w:rPr>
                 <w:rtl w:val="0"/>
               </w:rPr>
-              <w:t xml:space="preserve">E9 a E11</w:t>
+              <w:t xml:space="preserve">E9 a E12</w:t>
             </w:r>
           </w:p>
         </w:tc>
@@ -17549,21 +20610,7 @@
               <w:rPr>
                 <w:rtl w:val="0"/>
               </w:rPr>
-              <w:t xml:space="preserve">8</w:t>
-            </w:r>
-          </w:p>
-        </w:tc>
-        <w:tc>
-          <w:tcPr/>
-          <w:p>
-            <w:pPr>
-              <w:rPr/>
-            </w:pPr>
-            <w:r>
-              <w:rPr>
-                <w:rtl w:val="0"/>
-              </w:rPr>
-              <w:t xml:space="preserve">2</w:t>
+              <w:t xml:space="preserve">15</w:t>
             </w:r>
           </w:p>
         </w:tc>
@@ -17591,7 +20638,21 @@
               <w:rPr>
                 <w:rtl w:val="0"/>
               </w:rPr>
-              <w:t xml:space="preserve">2</w:t>
+              <w:t xml:space="preserve">6</w:t>
+            </w:r>
+          </w:p>
+        </w:tc>
+        <w:tc>
+          <w:tcPr/>
+          <w:p>
+            <w:pPr>
+              <w:rPr/>
+            </w:pPr>
+            <w:r>
+              <w:rPr>
+                <w:rtl w:val="0"/>
+              </w:rPr>
+              <w:t xml:space="preserve">5</w:t>
             </w:r>
           </w:p>
         </w:tc>
@@ -17634,69 +20695,6 @@
                 <w:bCs w:val="1"/>
                 <w:rtl w:val="0"/>
               </w:rPr>
-              <w:t xml:space="preserve">11</w:t>
-            </w:r>
-            <w:r>
-              <w:rPr>
-                <w:rtl w:val="0"/>
-              </w:rPr>
-            </w:r>
-          </w:p>
-        </w:tc>
-        <w:tc>
-          <w:tcPr/>
-          <w:p>
-            <w:pPr>
-              <w:rPr/>
-            </w:pPr>
-            <w:r>
-              <w:rPr>
-                <w:b w:val="1"/>
-                <w:bCs w:val="1"/>
-                <w:rtl w:val="0"/>
-              </w:rPr>
-              <w:t>43</w:t>
-            </w:r>
-            <w:r>
-              <w:rPr>
-                <w:rtl w:val="0"/>
-              </w:rPr>
-            </w:r>
-          </w:p>
-        </w:tc>
-        <w:tc>
-          <w:tcPr/>
-          <w:p>
-            <w:pPr>
-              <w:rPr/>
-            </w:pPr>
-            <w:r>
-              <w:rPr>
-                <w:b w:val="1"/>
-                <w:bCs w:val="1"/>
-                <w:rtl w:val="0"/>
-              </w:rPr>
-              <w:t>27</w:t>
-            </w:r>
-            <w:r>
-              <w:rPr>
-                <w:rtl w:val="0"/>
-              </w:rPr>
-            </w:r>
-          </w:p>
-        </w:tc>
-        <w:tc>
-          <w:tcPr/>
-          <w:p>
-            <w:pPr>
-              <w:rPr/>
-            </w:pPr>
-            <w:r>
-              <w:rPr>
-                <w:b w:val="1"/>
-                <w:bCs w:val="1"/>
-                <w:rtl w:val="0"/>
-              </w:rPr>
               <w:t xml:space="preserve">12</w:t>
             </w:r>
             <w:r>
@@ -17718,7 +20716,70 @@
                 <w:bCs w:val="1"/>
                 <w:rtl w:val="0"/>
               </w:rPr>
-              <w:t xml:space="preserve">4</w:t>
+              <w:t xml:space="preserve">50</w:t>
+            </w:r>
+            <w:r>
+              <w:rPr>
+                <w:rtl w:val="0"/>
+              </w:rPr>
+            </w:r>
+          </w:p>
+        </w:tc>
+        <w:tc>
+          <w:tcPr/>
+          <w:p>
+            <w:pPr>
+              <w:rPr/>
+            </w:pPr>
+            <w:r>
+              <w:rPr>
+                <w:b w:val="1"/>
+                <w:bCs w:val="1"/>
+                <w:rtl w:val="0"/>
+              </w:rPr>
+              <w:t xml:space="preserve">29</w:t>
+            </w:r>
+            <w:r>
+              <w:rPr>
+                <w:rtl w:val="0"/>
+              </w:rPr>
+            </w:r>
+          </w:p>
+        </w:tc>
+        <w:tc>
+          <w:tcPr/>
+          <w:p>
+            <w:pPr>
+              <w:rPr/>
+            </w:pPr>
+            <w:r>
+              <w:rPr>
+                <w:b w:val="1"/>
+                <w:bCs w:val="1"/>
+                <w:rtl w:val="0"/>
+              </w:rPr>
+              <w:t xml:space="preserve">14</w:t>
+            </w:r>
+            <w:r>
+              <w:rPr>
+                <w:rtl w:val="0"/>
+              </w:rPr>
+            </w:r>
+          </w:p>
+        </w:tc>
+        <w:tc>
+          <w:tcPr/>
+          <w:p>
+            <w:pPr>
+              <w:rPr/>
+            </w:pPr>
+            <w:r>
+              <w:rPr>
+                <w:b w:val="1"/>
+                <w:bCs w:val="1"/>
+                <w:rtl w:val="0"/>
+              </w:rPr>
+              <w:t xml:space="preserve">7</w:t>
             </w:r>
             <w:r>
               <w:rPr>

</xml_diff>